<commit_message>
docs: add SDD pagination and appendices
</commit_message>
<xml_diff>
--- a/TaiLieu/NhatKyTrienKhai_GiaiDoan/Mau_1_NhatKyTrienKhai_GiaiDoan.docx
+++ b/TaiLieu/NhatKyTrienKhai_GiaiDoan/Mau_1_NhatKyTrienKhai_GiaiDoan.docx
@@ -340,8 +340,6 @@
         </w:rPr>
         <w:t xml:space="preserve">Họ tên, chữ ký của người phụ trách công tác triển khai, quản lý quyển nhật ký công tác triển khai: </w:t>
       </w:r>
-      <w:bookmarkStart w:id="0" w:name="_GoBack"/>
-      <w:bookmarkEnd w:id="0"/>
     </w:p>
     <w:p>
       <w:pPr>
@@ -425,48 +423,6 @@
     </w:p>
     <w:p/>
     <w:p>
-      <w:r>
-        <w:br w:type="page"/>
-      </w:r>
-    </w:p>
-    <w:p>
-      <w:r>
-        <w:br w:type="page"/>
-      </w:r>
-    </w:p>
-    <w:p>
-      <w:r>
-        <w:br w:type="page"/>
-      </w:r>
-    </w:p>
-    <w:p>
-      <w:r>
-        <w:br w:type="page"/>
-      </w:r>
-    </w:p>
-    <w:p>
-      <w:r>
-        <w:br w:type="page"/>
-      </w:r>
-    </w:p>
-    <w:p>
-      <w:r>
-        <w:br w:type="page"/>
-      </w:r>
-    </w:p>
-    <w:p>
-      <w:r>
-        <w:br w:type="page"/>
-      </w:r>
-    </w:p>
-    <w:sectPr>
-      <w:footerReference w:type="default" r:id="rId9"/>
-      <w:pgSz w:w="11906" w:h="16838" w:orient="landscape"/>
-      <w:pgMar w:top="1020" w:right="964" w:bottom="1020" w:left="1134" w:header="567" w:footer="567" w:gutter="0"/>
-      <w:cols w:space="720"/>
-      <w:docGrid w:linePitch="360"/>
-    </w:sectPr>
-    <w:p>
       <w:pPr>
         <w:spacing w:after="60"/>
         <w:jc w:val="right"/>
@@ -524,7 +480,15 @@
           <w:sz w:val="24"/>
           <w:szCs w:val="24"/>
         </w:rPr>
-        <w:t>Giai đoạn 1 – Khảo sát hiện trạng và xây dựng tài liệu nghiệp vụ</w:t>
+        <w:t xml:space="preserve">Giai đoạn 1 – Khảo sát hiện </w:t>
+      </w:r>
+      <w:r>
+        <w:rPr>
+          <w:b/>
+          <w:sz w:val="24"/>
+          <w:szCs w:val="24"/>
+        </w:rPr>
+        <w:t>trạng và xây dựng tài liệu nghiệp vụ</w:t>
       </w:r>
     </w:p>
     <w:p>
@@ -707,7 +671,14 @@
                 <w:b/>
                 <w:sz w:val="22"/>
               </w:rPr>
-              <w:t>Ý kiến và chữ ký xác nhận của đại diện đơn vị giám sát công tác triển khai (nếu có) đố</w:t>
+              <w:t xml:space="preserve">Ý kiến và chữ ký xác nhận của đại </w:t>
+            </w:r>
+            <w:r>
+              <w:rPr>
+                <w:b/>
+                <w:sz w:val="22"/>
+              </w:rPr>
+              <w:t>diện đơn vị giám sát công tác triển khai (nếu có) đố</w:t>
             </w:r>
             <w:r>
               <w:rPr>
@@ -806,14 +777,26 @@
                 <w:sz w:val="22"/>
               </w:rPr>
               <w:br/>
-              <w:t>- Đã tổ chức làm việc với Chủ đầu tư/đơn vị sử dụng để xác định phạm vi, đầu mối phối hợp, quy trình nghiệp vụ hiện hành và nhu cầu cập nhật Hệ thống số liệu điều hành bay.</w:t>
+              <w:t xml:space="preserve">- Đã tổ chức làm việc với Chủ </w:t>
+            </w:r>
+            <w:r>
+              <w:rPr>
+                <w:sz w:val="22"/>
+              </w:rPr>
+              <w:t>đầu tư/đơn vị sử dụng để xác định phạm vi, đầu mối phối hợp, quy trình nghiệp vụ hiện hành và nhu cầu cập nhật Hệ thống số liệu điều hành bay.</w:t>
             </w:r>
             <w:r>
               <w:rPr>
                 <w:sz w:val="22"/>
               </w:rPr>
               <w:br/>
-              <w:t>- Đã khảo sát hiện trạng phần mềm, cơ sở dữ liệu, máy chủ, tài khoản/phân quyền, nhật ký hệ thống, quy trình vận hành, sao lưu và các môi trường phát triển–kiểm thử–vận hành.</w:t>
+              <w:t xml:space="preserve">- Đã khảo sát hiện trạng phần mềm, cơ sở dữ liệu, máy chủ, tài khoản/phân quyền, nhật ký hệ thống, quy trình vận </w:t>
+            </w:r>
+            <w:r>
+              <w:rPr>
+                <w:sz w:val="22"/>
+              </w:rPr>
+              <w:t>hành, sao lưu và các môi trường phát triển–kiểm thử–vận hành.</w:t>
             </w:r>
             <w:r>
               <w:rPr>
@@ -827,14 +810,26 @@
                 <w:sz w:val="22"/>
               </w:rPr>
               <w:br/>
-              <w:t>- Đã khảo sát nguồn và mẫu dữ liệu email/thư mục, ADS-B, SLOT, AMHS, KHB/KHB quân sự, vùng trời, Bravo và API; ghi nhận định dạng, tần suất, quy tắc đối soát và điều kiện kết nối.</w:t>
+              <w:t>- Đã khảo sát nguồn và mẫu dữ liệu email/th</w:t>
+            </w:r>
+            <w:r>
+              <w:rPr>
+                <w:sz w:val="22"/>
+              </w:rPr>
+              <w:t>ư mục, ADS-B, SLOT, AMHS, KHB/KHB quân sự, vùng trời, Bravo và API; ghi nhận định dạng, tần suất, quy tắc đối soát và điều kiện kết nối.</w:t>
             </w:r>
             <w:r>
               <w:rPr>
                 <w:sz w:val="22"/>
               </w:rPr>
               <w:br/>
-              <w:t>- Đã thu thập biểu mẫu báo cáo, kịch bản cảnh báo, quy tắc nghiệp vụ, yêu cầu tìm kiếm/thống kê, yêu cầu hiệu năng và các trường hợp ngoại lệ cần xử lý.</w:t>
+              <w:t>- Đã thu thập biểu mẫu báo cáo, kịch bản cảnh báo, quy tắc nghiệp vụ, yêu cầu tìm kiếm/thống kê, yêu cầu hiệu năng và c</w:t>
+            </w:r>
+            <w:r>
+              <w:rPr>
+                <w:sz w:val="22"/>
+              </w:rPr>
+              <w:t>ác trường hợp ngoại lệ cần xử lý.</w:t>
             </w:r>
             <w:r>
               <w:rPr>
@@ -855,20 +850,27 @@
                 <w:sz w:val="22"/>
               </w:rPr>
               <w:br/>
-              <w:t>- Biên bản khảo sát hiện trạng và yêu cầu nghiệp vụ; số 01/2026/BBKS-HTQLSLB; ngày 13/07/2026; phiên bản 1.0.</w:t>
+              <w:t>- Biên bản khảo sát hiện trạng và yêu cầu nghi</w:t>
+            </w:r>
+            <w:r>
+              <w:rPr>
+                <w:sz w:val="22"/>
+              </w:rPr>
+              <w:t>ệp vụ; số 01/2026/BBKS-HTQLSLB; ngày 13/07/2026; phiên bản 1.0.</w:t>
             </w:r>
             <w:r>
               <w:rPr>
                 <w:sz w:val="22"/>
               </w:rPr>
               <w:br/>
+              <w:t xml:space="preserve">- Báo cáo kết quả khảo sát; số 01/2026/BCKS-HTQLSLB; ngày 13/07/2026; </w:t>
             </w:r>
             <w:r>
               <w:rPr>
                 <w:sz w:val="22"/>
               </w:rPr>
               <w:lastRenderedPageBreak/>
-              <w:t>- Báo cáo kết quả khảo sát; số 01/2026/BCKS-HTQLSLB; ngày 13/07/2026; phiên bản 1.0.</w:t>
+              <w:t>phiên bản 1.0.</w:t>
             </w:r>
             <w:r>
               <w:rPr>
@@ -888,21 +890,39 @@
                 <w:sz w:val="22"/>
               </w:rPr>
               <w:br/>
-              <w:t>Tình trạng hoàn thành: Hoàn thành 100% ngày 13/07/2026, đúng mốc Ngày 5; các tài liệu khảo sát và phạm vi 53 chức năng đã được tổng hợp để chuyển sang phân tích–thiết kế.</w:t>
+              <w:t>Tình trạ</w:t>
+            </w:r>
+            <w:r>
+              <w:rPr>
+                <w:sz w:val="22"/>
+              </w:rPr>
+              <w:t>ng hoàn thành: Hoàn thành 100% ngày 13/07/2026, đúng mốc Ngày 5; các tài liệu khảo sát và phạm vi 53 chức năng đã được tổng hợp để chuyển sang phân tích–thiết kế.</w:t>
             </w:r>
             <w:r>
               <w:rPr>
                 <w:sz w:val="22"/>
               </w:rPr>
               <w:br/>
-              <w:t>Sự cố, sai khác, phát sinh và biện pháp xử lý: Không có sự cố ảnh hưởng tiến độ. Các nội dung cần bổ sung dữ liệu mẫu, thông tin kết nối và biểu mẫu báo cáo đã được đưa vào HTQLSLB-DSVD-01, phân công đầu mối và xử lý trong các giai đoạn tiếp theo.</w:t>
+              <w:t>Sự cố, sai khác, phát sinh và biện pháp xử lý: Không có sự cố ảnh hưởng tiến độ. Các nội dung</w:t>
+            </w:r>
+            <w:r>
+              <w:rPr>
+                <w:sz w:val="22"/>
+              </w:rPr>
+              <w:t xml:space="preserve"> cần bổ sung dữ liệu mẫu, thông tin kết nối và biểu mẫu báo cáo đã được đưa vào HTQLSLB-DSVD-01, phân công đầu mối và xử lý trong các giai đoạn tiếp theo.</w:t>
             </w:r>
             <w:r>
               <w:rPr>
                 <w:sz w:val="22"/>
               </w:rPr>
               <w:br/>
-              <w:t>Đề nghị, kiến nghị và ý kiến giải quyết: Các bên thống nhất sử dụng Biên bản khảo sát, Báo cáo khảo sát và HTQLSLB-TLNV-01 làm đầu vào chính thức cho Giai đoạn 2.</w:t>
+              <w:t>Đề nghị, kiến nghị và ý kiến giải quyết: Các bên thống nhất sử dụng Biên bản khảo sát, Báo cáo khảo s</w:t>
+            </w:r>
+            <w:r>
+              <w:rPr>
+                <w:sz w:val="22"/>
+              </w:rPr>
+              <w:t>át và HTQLSLB-TLNV-01 làm đầu vào chính thức cho Giai đoạn 2.</w:t>
             </w:r>
           </w:p>
         </w:tc>
@@ -932,7 +952,6 @@
           <w:szCs w:val="24"/>
         </w:rPr>
       </w:pPr>
-      <w:bookmarkStart w:id="0" w:name="_GoBack"/>
       <w:r>
         <w:rPr>
           <w:rFonts w:ascii="Times New Roman" w:eastAsia="Times New Roman" w:hAnsi="Times New Roman"/>
@@ -959,7 +978,6 @@
         <w:t>Hồ sơ kèm theo/đối chiếu: xem đầy đủ tên, mã/số, ngày và phiên bản tại mục Kết quả/sản phẩm đã hoàn thành trong bảng nhật ký.</w:t>
       </w:r>
     </w:p>
-    <w:bookmarkEnd w:id="0"/>
     <w:p>
       <w:r>
         <w:t>……………………………………………………………………………….…………………………………………………………………………………………</w:t>
@@ -980,7 +998,10 @@
     <w:p/>
     <w:p>
       <w:r>
-        <w:t>……………………………………………………………………………….…………………………………………………………………………………………</w:t>
+        <w:t>……………………………………………………………………………….………………………………………………………………</w:t>
+      </w:r>
+      <w:r>
+        <w:t>…………………………</w:t>
       </w:r>
     </w:p>
     <w:p/>
@@ -989,11 +1010,57 @@
       <w:pPr>
         <w:spacing w:after="60"/>
         <w:jc w:val="right"/>
+        <w:rPr>
+          <w:sz w:val="24"/>
+        </w:rPr>
+      </w:pPr>
+    </w:p>
+    <w:p>
+      <w:pPr>
+        <w:spacing w:after="60"/>
+        <w:jc w:val="right"/>
+        <w:rPr>
+          <w:sz w:val="24"/>
+        </w:rPr>
+      </w:pPr>
+    </w:p>
+    <w:p>
+      <w:pPr>
+        <w:spacing w:after="60"/>
+        <w:jc w:val="right"/>
+        <w:rPr>
+          <w:sz w:val="24"/>
+        </w:rPr>
+      </w:pPr>
+    </w:p>
+    <w:p>
+      <w:pPr>
+        <w:spacing w:after="60"/>
+        <w:jc w:val="right"/>
+        <w:rPr>
+          <w:sz w:val="24"/>
+        </w:rPr>
+      </w:pPr>
+    </w:p>
+    <w:p>
+      <w:pPr>
+        <w:spacing w:after="60"/>
+        <w:jc w:val="right"/>
+        <w:rPr>
+          <w:sz w:val="24"/>
+        </w:rPr>
+      </w:pPr>
+    </w:p>
+    <w:p>
+      <w:pPr>
+        <w:spacing w:after="60"/>
+        <w:jc w:val="right"/>
       </w:pPr>
       <w:r>
         <w:rPr>
           <w:sz w:val="24"/>
         </w:rPr>
+        <w:lastRenderedPageBreak/>
         <w:t>Mẫu số 1.1. Nội dung ghi nhật ký công tác triển khai</w:t>
       </w:r>
     </w:p>
@@ -1056,6 +1123,654 @@
           <w:szCs w:val="24"/>
         </w:rPr>
         <w:t>Công việc: Cài đặt, cập nhật, hiệu chỉnh cơ sở dữ liệu, phần mềm Hệ thống số liệu điều hành bay</w:t>
+      </w:r>
+    </w:p>
+    <w:p>
+      <w:pPr>
+        <w:pStyle w:val="Heading1"/>
+        <w:spacing w:before="0" w:after="60"/>
+        <w:rPr>
+          <w:color w:val="auto"/>
+          <w:szCs w:val="24"/>
+        </w:rPr>
+      </w:pPr>
+      <w:r>
+        <w:rPr>
+          <w:rFonts w:ascii="Times New Roman" w:eastAsia="Times New Roman" w:hAnsi="Times New Roman"/>
+          <w:b w:val="0"/>
+          <w:color w:val="auto"/>
+          <w:szCs w:val="24"/>
+        </w:rPr>
+        <w:t xml:space="preserve">I. </w:t>
+      </w:r>
+      <w:r>
+        <w:rPr>
+          <w:rFonts w:ascii="Times New Roman" w:eastAsia="Times New Roman" w:hAnsi="Times New Roman"/>
+          <w:b w:val="0"/>
+          <w:color w:val="auto"/>
+          <w:szCs w:val="24"/>
+        </w:rPr>
+        <w:t>Nội dung công tác triển khai</w:t>
+      </w:r>
+    </w:p>
+    <w:tbl>
+      <w:tblPr>
+        <w:tblW w:w="14200" w:type="dxa"/>
+        <w:jc w:val="center"/>
+        <w:tblBorders>
+          <w:top w:val="single" w:sz="8" w:space="0" w:color="808080"/>
+          <w:left w:val="single" w:sz="8" w:space="0" w:color="808080"/>
+          <w:bottom w:val="single" w:sz="8" w:space="0" w:color="808080"/>
+          <w:right w:val="single" w:sz="8" w:space="0" w:color="808080"/>
+          <w:insideH w:val="single" w:sz="8" w:space="0" w:color="808080"/>
+          <w:insideV w:val="single" w:sz="8" w:space="0" w:color="808080"/>
+        </w:tblBorders>
+        <w:tblLayout w:type="fixed"/>
+        <w:tblLook w:val="04A0" w:firstRow="1" w:lastRow="0" w:firstColumn="1" w:lastColumn="0" w:noHBand="0" w:noVBand="1"/>
+      </w:tblPr>
+      <w:tblGrid>
+        <w:gridCol w:w="700"/>
+        <w:gridCol w:w="1900"/>
+        <w:gridCol w:w="5200"/>
+        <w:gridCol w:w="6400"/>
+      </w:tblGrid>
+      <w:tr>
+        <w:trPr>
+          <w:tblHeader/>
+          <w:jc w:val="center"/>
+        </w:trPr>
+        <w:tc>
+          <w:tcPr>
+            <w:tcW w:w="700" w:type="dxa"/>
+            <w:shd w:val="clear" w:color="auto" w:fill="D9EAF7"/>
+            <w:tcMar>
+              <w:top w:w="100" w:type="dxa"/>
+              <w:left w:w="100" w:type="dxa"/>
+              <w:bottom w:w="100" w:type="dxa"/>
+              <w:right w:w="100" w:type="dxa"/>
+            </w:tcMar>
+          </w:tcPr>
+          <w:p>
+            <w:pPr>
+              <w:spacing w:after="0" w:line="240" w:lineRule="auto"/>
+              <w:jc w:val="center"/>
+              <w:rPr>
+                <w:sz w:val="22"/>
+              </w:rPr>
+            </w:pPr>
+            <w:r>
+              <w:rPr>
+                <w:b/>
+                <w:sz w:val="22"/>
+              </w:rPr>
+              <w:t>STT</w:t>
+            </w:r>
+          </w:p>
+        </w:tc>
+        <w:tc>
+          <w:tcPr>
+            <w:tcW w:w="1900" w:type="dxa"/>
+            <w:shd w:val="clear" w:color="auto" w:fill="D9EAF7"/>
+            <w:tcMar>
+              <w:top w:w="100" w:type="dxa"/>
+              <w:left w:w="100" w:type="dxa"/>
+              <w:bottom w:w="100" w:type="dxa"/>
+              <w:right w:w="100" w:type="dxa"/>
+            </w:tcMar>
+          </w:tcPr>
+          <w:p>
+            <w:pPr>
+              <w:spacing w:after="0" w:line="240" w:lineRule="auto"/>
+              <w:jc w:val="center"/>
+              <w:rPr>
+                <w:sz w:val="22"/>
+              </w:rPr>
+            </w:pPr>
+            <w:r>
+              <w:rPr>
+                <w:b/>
+                <w:sz w:val="22"/>
+              </w:rPr>
+              <w:t>Thời gian triển khai</w:t>
+            </w:r>
+          </w:p>
+        </w:tc>
+        <w:tc>
+          <w:tcPr>
+            <w:tcW w:w="5200" w:type="dxa"/>
+            <w:shd w:val="clear" w:color="auto" w:fill="D9EAF7"/>
+            <w:tcMar>
+              <w:top w:w="100" w:type="dxa"/>
+              <w:left w:w="100" w:type="dxa"/>
+              <w:bottom w:w="100" w:type="dxa"/>
+              <w:right w:w="100" w:type="dxa"/>
+            </w:tcMar>
+          </w:tcPr>
+          <w:p>
+            <w:pPr>
+              <w:spacing w:after="0" w:line="240" w:lineRule="auto"/>
+              <w:jc w:val="center"/>
+              <w:rPr>
+                <w:sz w:val="22"/>
+              </w:rPr>
+            </w:pPr>
+            <w:r>
+              <w:rPr>
+                <w:b/>
+                <w:sz w:val="22"/>
+              </w:rPr>
+              <w:t>Nội dung công tác triển khai</w:t>
+            </w:r>
+          </w:p>
+        </w:tc>
+        <w:tc>
+          <w:tcPr>
+            <w:tcW w:w="6400" w:type="dxa"/>
+            <w:shd w:val="clear" w:color="auto" w:fill="D9EAF7"/>
+            <w:tcMar>
+              <w:top w:w="100" w:type="dxa"/>
+              <w:left w:w="100" w:type="dxa"/>
+              <w:bottom w:w="100" w:type="dxa"/>
+              <w:right w:w="100" w:type="dxa"/>
+            </w:tcMar>
+          </w:tcPr>
+          <w:p>
+            <w:pPr>
+              <w:spacing w:after="0" w:line="240" w:lineRule="auto"/>
+              <w:jc w:val="center"/>
+              <w:rPr>
+                <w:sz w:val="22"/>
+              </w:rPr>
+            </w:pPr>
+            <w:r>
+              <w:rPr>
+                <w:b/>
+                <w:sz w:val="22"/>
+              </w:rPr>
+              <w:t>Ý kiến và chữ ký xác nhận của đại diện đơn vị giám sát công tác triển khai (nếu có) đố</w:t>
+            </w:r>
+            <w:r>
+              <w:rPr>
+                <w:b/>
+                <w:sz w:val="22"/>
+              </w:rPr>
+              <w:t>i với các nội dung triển khai.</w:t>
+            </w:r>
+            <w:r>
+              <w:rPr>
+                <w:b/>
+                <w:sz w:val="22"/>
+              </w:rPr>
+              <w:br/>
+            </w:r>
+          </w:p>
+        </w:tc>
+      </w:tr>
+      <w:tr>
+        <w:trPr>
+          <w:jc w:val="center"/>
+        </w:trPr>
+        <w:tc>
+          <w:tcPr>
+            <w:tcW w:w="700" w:type="dxa"/>
+            <w:vAlign w:val="center"/>
+          </w:tcPr>
+          <w:p>
+            <w:pPr>
+              <w:spacing w:after="0" w:line="240" w:lineRule="auto"/>
+              <w:rPr>
+                <w:sz w:val="22"/>
+              </w:rPr>
+            </w:pPr>
+            <w:r>
+              <w:rPr>
+                <w:sz w:val="22"/>
+              </w:rPr>
+              <w:t>2</w:t>
+            </w:r>
+          </w:p>
+        </w:tc>
+        <w:tc>
+          <w:tcPr>
+            <w:tcW w:w="1900" w:type="dxa"/>
+            <w:vAlign w:val="center"/>
+          </w:tcPr>
+          <w:p>
+            <w:pPr>
+              <w:spacing w:after="0" w:line="240" w:lineRule="auto"/>
+              <w:rPr>
+                <w:sz w:val="22"/>
+              </w:rPr>
+            </w:pPr>
+            <w:r>
+              <w:rPr>
+                <w:sz w:val="22"/>
+              </w:rPr>
+              <w:t>Ngày 1 – 10</w:t>
+            </w:r>
+            <w:r>
+              <w:rPr>
+                <w:sz w:val="22"/>
+              </w:rPr>
+              <w:br/>
+              <w:t>Từ: 09/07/2026</w:t>
+            </w:r>
+            <w:r>
+              <w:rPr>
+                <w:sz w:val="22"/>
+              </w:rPr>
+              <w:br/>
+              <w:t>Đến: 18/07/2026</w:t>
+            </w:r>
+          </w:p>
+        </w:tc>
+        <w:tc>
+          <w:tcPr>
+            <w:tcW w:w="5200" w:type="dxa"/>
+          </w:tcPr>
+          <w:p>
+            <w:pPr>
+              <w:spacing w:after="0" w:line="240" w:lineRule="auto"/>
+              <w:rPr>
+                <w:sz w:val="22"/>
+              </w:rPr>
+            </w:pPr>
+            <w:r>
+              <w:rPr>
+                <w:sz w:val="22"/>
+              </w:rPr>
+              <w:t>Giai đoạn</w:t>
+            </w:r>
+            <w:r>
+              <w:rPr>
+                <w:sz w:val="22"/>
+              </w:rPr>
+              <w:t xml:space="preserve"> 2 – Phân tích yêu cầu và thiết kế kỹ thuật</w:t>
+            </w:r>
+            <w:r>
+              <w:rPr>
+                <w:sz w:val="22"/>
+              </w:rPr>
+              <w:br/>
+              <w:t>Công việc thực tế đã thực hiện:</w:t>
+            </w:r>
+            <w:r>
+              <w:rPr>
+                <w:sz w:val="22"/>
+              </w:rPr>
+              <w:br/>
+              <w:t>- Đã phân tích yêu cầu chức năng cho 05 nhóm/53 chức năng; xác định đầu vào, quy tắc xử lý, đầu ra, trường hợp ngoại lệ, quyền sử dụng và tiêu chí chấp nhận.</w:t>
+            </w:r>
+            <w:r>
+              <w:rPr>
+                <w:sz w:val="22"/>
+              </w:rPr>
+              <w:br/>
+              <w:t>- Đã phân tích yêu cầu</w:t>
+            </w:r>
+            <w:r>
+              <w:rPr>
+                <w:sz w:val="22"/>
+              </w:rPr>
+              <w:t xml:space="preserve"> phi chức năng về hiệu năng, an toàn thông tin, lưu vết, tính sẵn sàng, sao lưu/khôi phục, khả năng mở rộng và vận hành.</w:t>
+            </w:r>
+            <w:r>
+              <w:rPr>
+                <w:sz w:val="22"/>
+              </w:rPr>
+              <w:br/>
+              <w:t>- Đã xây dựng phương án kiến trúc ứng dụng, cơ sở dữ liệu, API/tích hợp email–ADS-B–SLOT–AMHS–Bravo và phương án triển khai trên các má</w:t>
+            </w:r>
+            <w:r>
+              <w:rPr>
+                <w:sz w:val="22"/>
+              </w:rPr>
+              <w:t>y chủ.</w:t>
+            </w:r>
+            <w:r>
+              <w:rPr>
+                <w:sz w:val="22"/>
+              </w:rPr>
+              <w:br/>
+              <w:t>- Đã thiết kế giao diện, luồng nghiệp vụ, mô hình dữ liệu, cấu trúc bảng/trường, dịch vụ, thông báo/cảnh báo, báo cáo và phân quyền.</w:t>
+            </w:r>
+            <w:r>
+              <w:rPr>
+                <w:sz w:val="22"/>
+              </w:rPr>
+              <w:br/>
+              <w:t>- Đã tổ chức rà soát với Chủ đầu tư/đơn vị sử dụng; cập nhật các ý kiến và quản lý thay đổi so với phạm vi ban đầu.</w:t>
+            </w:r>
+            <w:r>
+              <w:rPr>
+                <w:sz w:val="22"/>
+              </w:rPr>
+              <w:br/>
+            </w:r>
+            <w:r>
+              <w:rPr>
+                <w:sz w:val="22"/>
+              </w:rPr>
+              <w:t>- Đã xác định kế hoạch kiểm thử, dữ liệu kiểm thử, môi trường, điều kiện vào/ra và ma trận truy vết yêu cầu–thiết kế–kiểm thử.</w:t>
+            </w:r>
+            <w:r>
+              <w:rPr>
+                <w:sz w:val="22"/>
+              </w:rPr>
+              <w:br/>
+              <w:t>Kết quả/sản phẩm đã hoàn thành:</w:t>
+            </w:r>
+            <w:r>
+              <w:rPr>
+                <w:sz w:val="22"/>
+              </w:rPr>
+              <w:br/>
+              <w:t>- Tài liệu đặc tả yêu cầu phần mềm (SRS); mã HTQLSLB-SRS-01; ngày 18/07/2026; phiên bản 1.0.</w:t>
+            </w:r>
+            <w:r>
+              <w:rPr>
+                <w:sz w:val="22"/>
+              </w:rPr>
+              <w:br/>
+              <w:t>- Tà</w:t>
+            </w:r>
+            <w:r>
+              <w:rPr>
+                <w:sz w:val="22"/>
+              </w:rPr>
+              <w:t xml:space="preserve">i liệu thiết kế chi tiết hệ thống; số 01/2026/TKCT-HTQLSLB; </w:t>
+            </w:r>
+            <w:r>
+              <w:rPr>
+                <w:sz w:val="22"/>
+              </w:rPr>
+              <w:t>ngày 18/07/2026; phiên bản 1.0.</w:t>
+            </w:r>
+            <w:r>
+              <w:rPr>
+                <w:sz w:val="22"/>
+              </w:rPr>
+              <w:br/>
+              <w:t xml:space="preserve">Tình trạng hoàn thành: Hoàn thành 100% ngày </w:t>
+            </w:r>
+            <w:r>
+              <w:rPr>
+                <w:sz w:val="22"/>
+              </w:rPr>
+              <w:lastRenderedPageBreak/>
+              <w:t>18/07/2026, đúng mốc Ngày 10; toàn bộ 05 nhóm/53 chức năng đã có yêu cầu, thiết kế và tiêu chí kiểm tra tương ứng.</w:t>
+            </w:r>
+            <w:r>
+              <w:rPr>
+                <w:sz w:val="22"/>
+              </w:rPr>
+              <w:br/>
+              <w:t>Sự cố</w:t>
+            </w:r>
+            <w:r>
+              <w:rPr>
+                <w:sz w:val="22"/>
+              </w:rPr>
+              <w:t>, sai khác, phát sinh và biện pháp xử lý: Không có sai khác ảnh hưởng phạm vi hoặc tiến độ. Các ý kiến rà soát về dữ liệu, phân quyền, tích hợp và tiêu chí báo cáo đã được cập nhật vào phiên bản 1.0 của các tài liệu.</w:t>
+            </w:r>
+            <w:r>
+              <w:rPr>
+                <w:sz w:val="22"/>
+              </w:rPr>
+              <w:br/>
+              <w:t>Đề nghị, kiến nghị và ý kiến giải quyết</w:t>
+            </w:r>
+            <w:r>
+              <w:rPr>
+                <w:sz w:val="22"/>
+              </w:rPr>
+              <w:t>: Thống nhất chốt bộ tài liệu phiên bản 1.0 làm đường cơ sở để lập trình, quản lý thay đổi và kiểm thử.</w:t>
+            </w:r>
+          </w:p>
+        </w:tc>
+        <w:tc>
+          <w:tcPr>
+            <w:tcW w:w="6400" w:type="dxa"/>
+            <w:vAlign w:val="center"/>
+          </w:tcPr>
+          <w:p>
+            <w:pPr>
+              <w:spacing w:after="0" w:line="240" w:lineRule="auto"/>
+              <w:rPr>
+                <w:sz w:val="22"/>
+              </w:rPr>
+            </w:pPr>
+          </w:p>
+        </w:tc>
+      </w:tr>
+    </w:tbl>
+    <w:p/>
+    <w:p>
+      <w:pPr>
+        <w:pStyle w:val="Heading1"/>
+        <w:spacing w:before="0" w:after="60"/>
+        <w:rPr>
+          <w:color w:val="auto"/>
+          <w:szCs w:val="24"/>
+        </w:rPr>
+      </w:pPr>
+      <w:r>
+        <w:rPr>
+          <w:rFonts w:ascii="Times New Roman" w:eastAsia="Times New Roman" w:hAnsi="Times New Roman"/>
+          <w:b w:val="0"/>
+          <w:color w:val="auto"/>
+          <w:szCs w:val="24"/>
+        </w:rPr>
+        <w:t>II. Các nội dung khác (nếu có)</w:t>
+      </w:r>
+    </w:p>
+    <w:p>
+      <w:pPr>
+        <w:rPr>
+          <w:sz w:val="24"/>
+          <w:szCs w:val="24"/>
+        </w:rPr>
+      </w:pPr>
+      <w:r>
+        <w:rPr>
+          <w:i/>
+          <w:sz w:val="24"/>
+          <w:szCs w:val="24"/>
+        </w:rPr>
+        <w:t xml:space="preserve">Hồ sơ kèm theo/đối chiếu: xem đầy đủ tên, mã/số, ngày và phiên bản tại mục Kết quả/sản phẩm đã hoàn thành trong bảng </w:t>
+      </w:r>
+      <w:r>
+        <w:rPr>
+          <w:i/>
+          <w:sz w:val="24"/>
+          <w:szCs w:val="24"/>
+        </w:rPr>
+        <w:t>nhật ký.</w:t>
+      </w:r>
+    </w:p>
+    <w:p>
+      <w:r>
+        <w:t>……………………………………………………………………………….…………………………………………………………………………………………</w:t>
+      </w:r>
+    </w:p>
+    <w:p/>
+    <w:p>
+      <w:r>
+        <w:t>……………………………………………………………………………….…………………………………………………………………………………………</w:t>
+      </w:r>
+    </w:p>
+    <w:p/>
+    <w:p>
+      <w:r>
+        <w:t>……………………………………………………………………………….…………………………………………………………………………………………</w:t>
+      </w:r>
+    </w:p>
+    <w:p/>
+    <w:p>
+      <w:r>
+        <w:t>……………………………………………………………………………….………………………………………</w:t>
+      </w:r>
+      <w:r>
+        <w:t>…………………………………………………</w:t>
+      </w:r>
+    </w:p>
+    <w:p/>
+    <w:p/>
+    <w:p>
+      <w:pPr>
+        <w:spacing w:after="60"/>
+        <w:jc w:val="right"/>
+        <w:rPr>
+          <w:sz w:val="24"/>
+        </w:rPr>
+      </w:pPr>
+    </w:p>
+    <w:p>
+      <w:pPr>
+        <w:spacing w:after="60"/>
+        <w:jc w:val="right"/>
+        <w:rPr>
+          <w:sz w:val="24"/>
+        </w:rPr>
+      </w:pPr>
+    </w:p>
+    <w:p>
+      <w:pPr>
+        <w:spacing w:after="60"/>
+        <w:jc w:val="right"/>
+        <w:rPr>
+          <w:sz w:val="24"/>
+        </w:rPr>
+      </w:pPr>
+    </w:p>
+    <w:p>
+      <w:pPr>
+        <w:spacing w:after="60"/>
+        <w:jc w:val="right"/>
+        <w:rPr>
+          <w:sz w:val="24"/>
+        </w:rPr>
+      </w:pPr>
+    </w:p>
+    <w:p>
+      <w:pPr>
+        <w:spacing w:after="60"/>
+        <w:jc w:val="right"/>
+        <w:rPr>
+          <w:sz w:val="24"/>
+        </w:rPr>
+      </w:pPr>
+    </w:p>
+    <w:p>
+      <w:pPr>
+        <w:spacing w:after="60"/>
+        <w:jc w:val="right"/>
+        <w:rPr>
+          <w:sz w:val="24"/>
+        </w:rPr>
+      </w:pPr>
+    </w:p>
+    <w:p>
+      <w:pPr>
+        <w:spacing w:after="60"/>
+        <w:jc w:val="right"/>
+        <w:rPr>
+          <w:sz w:val="24"/>
+        </w:rPr>
+      </w:pPr>
+    </w:p>
+    <w:p>
+      <w:pPr>
+        <w:spacing w:after="60"/>
+        <w:jc w:val="right"/>
+        <w:rPr>
+          <w:sz w:val="24"/>
+        </w:rPr>
+      </w:pPr>
+    </w:p>
+    <w:p>
+      <w:pPr>
+        <w:spacing w:after="60"/>
+        <w:jc w:val="right"/>
+      </w:pPr>
+      <w:r>
+        <w:rPr>
+          <w:sz w:val="24"/>
+        </w:rPr>
+        <w:lastRenderedPageBreak/>
+        <w:t>Mẫu số 1.1. Nội dung ghi nhật ký công tác triển khai</w:t>
+      </w:r>
+    </w:p>
+    <w:p>
+      <w:pPr>
+        <w:spacing w:after="60"/>
+        <w:jc w:val="center"/>
+        <w:rPr>
+          <w:b/>
+          <w:sz w:val="32"/>
+          <w:szCs w:val="32"/>
+        </w:rPr>
+      </w:pPr>
+      <w:r>
+        <w:rPr>
+          <w:b/>
+          <w:sz w:val="32"/>
+          <w:szCs w:val="32"/>
+        </w:rPr>
+        <w:t>NỘI DUNG NHẬT KÝ CÔNG TÁC TRIỂN KHAI</w:t>
+      </w:r>
+    </w:p>
+    <w:p>
+      <w:pPr>
+        <w:spacing w:after="60"/>
+        <w:jc w:val="center"/>
+        <w:rPr>
+          <w:b/>
+          <w:sz w:val="24"/>
+          <w:szCs w:val="24"/>
+        </w:rPr>
+      </w:pPr>
+      <w:r>
+        <w:rPr>
+          <w:b/>
+          <w:sz w:val="24"/>
+          <w:szCs w:val="24"/>
+        </w:rPr>
+        <w:t>Giai đoạn 3 – Lập trình, cập nhật và hiệu chỉnh phần mềm</w:t>
+      </w:r>
+    </w:p>
+    <w:p>
+      <w:pPr>
+        <w:spacing w:after="60"/>
+        <w:jc w:val="center"/>
+        <w:rPr>
+          <w:b/>
+          <w:sz w:val="24"/>
+          <w:szCs w:val="24"/>
+        </w:rPr>
+      </w:pPr>
+    </w:p>
+    <w:p>
+      <w:pPr>
+        <w:spacing w:after="60"/>
+        <w:rPr>
+          <w:sz w:val="24"/>
+          <w:szCs w:val="24"/>
+        </w:rPr>
+      </w:pPr>
+      <w:r>
+        <w:rPr>
+          <w:sz w:val="24"/>
+          <w:szCs w:val="24"/>
+        </w:rPr>
+        <w:t>Công việc: Cài đặt, cập nhật, hiệu chỉnh cơ sở dữ liệu, phần mềm Hệ thống số liệu điều</w:t>
+      </w:r>
+      <w:r>
+        <w:rPr>
+          <w:sz w:val="24"/>
+          <w:szCs w:val="24"/>
+        </w:rPr>
+        <w:t xml:space="preserve"> hành bay</w:t>
       </w:r>
     </w:p>
     <w:p>
@@ -1211,21 +1926,14 @@
                 <w:b/>
                 <w:sz w:val="22"/>
               </w:rPr>
-              <w:t>Ý kiến và chữ ký xác nhận của đại diện đơn vị giám sát công tác triển khai (nếu có) đố</w:t>
+              <w:t>Ý kiến và chữ ký xác nhận của đại diện đơn vị giám sát công tác triển khai (nếu có) đ</w:t>
             </w:r>
             <w:r>
               <w:rPr>
                 <w:b/>
                 <w:sz w:val="22"/>
               </w:rPr>
-              <w:t>i với các nội dung triển khai.</w:t>
-            </w:r>
-            <w:r>
-              <w:rPr>
-                <w:b/>
-                <w:sz w:val="22"/>
-              </w:rPr>
-              <w:br/>
+              <w:t>ối với các nội dung triển khai.</w:t>
             </w:r>
           </w:p>
         </w:tc>
@@ -1250,7 +1958,7 @@
               <w:rPr>
                 <w:sz w:val="22"/>
               </w:rPr>
-              <w:t>2</w:t>
+              <w:t>3</w:t>
             </w:r>
           </w:p>
         </w:tc>
@@ -1270,21 +1978,27 @@
               <w:rPr>
                 <w:sz w:val="22"/>
               </w:rPr>
-              <w:t>Ngày 1 – 10</w:t>
+              <w:t>Ngày 8 – 25</w:t>
             </w:r>
             <w:r>
               <w:rPr>
                 <w:sz w:val="22"/>
               </w:rPr>
               <w:br/>
-              <w:t>Từ: 09/07/2026</w:t>
+              <w:t>Từ: 16/07/2026</w:t>
             </w:r>
             <w:r>
               <w:rPr>
                 <w:sz w:val="22"/>
               </w:rPr>
               <w:br/>
-              <w:t>Đến: 18/07/2026</w:t>
+              <w:t xml:space="preserve">Đến: </w:t>
+            </w:r>
+            <w:r>
+              <w:rPr>
+                <w:sz w:val="22"/>
+              </w:rPr>
+              <w:t>02/08/2026</w:t>
             </w:r>
           </w:p>
         </w:tc>
@@ -1303,7 +2017,7 @@
               <w:rPr>
                 <w:sz w:val="22"/>
               </w:rPr>
-              <w:t>Giai đoạn 2 – Phân tích yêu cầu và thiết kế kỹ thuật</w:t>
+              <w:t>Giai đoạn 3 – Lập trình, cập nhật và hiệu chỉnh phần mềm</w:t>
             </w:r>
             <w:r>
               <w:rPr>
@@ -1317,42 +2031,60 @@
                 <w:sz w:val="22"/>
               </w:rPr>
               <w:br/>
-              <w:t>- Đã phân tích yêu cầu chức năng cho 05 nhóm/53 chức năng; xác định đầu vào, quy tắc xử lý, đầu ra, trường hợp ngoại lệ, quyền sử dụng và tiêu chí chấp nhận.</w:t>
+              <w:t>- Đã thiết lập nhánh/mốc quản lý phiên bản, môi trường phát triển và quy ước xây dựng, đóng gói, kiểm soát thay đổi mã nguồn.</w:t>
             </w:r>
             <w:r>
               <w:rPr>
                 <w:sz w:val="22"/>
               </w:rPr>
               <w:br/>
-              <w:t>- Đã phân tích yêu cầu phi chức năng về hiệu năng, an toàn thông tin, lưu vết, tính sẵn sàng, sao lưu/khôi phục, khả năng mở rộng và vận hành.</w:t>
+              <w:t>- Đã lập trình các chức năng t</w:t>
+            </w:r>
+            <w:r>
+              <w:rPr>
+                <w:sz w:val="22"/>
+              </w:rPr>
+              <w:t>ích hợp và tự động hóa dữ liệu: email/thư mục, ADS-B, SLOT, AMHS, Gateway/API và xử lý lỗi tích hợp.</w:t>
             </w:r>
             <w:r>
               <w:rPr>
                 <w:sz w:val="22"/>
               </w:rPr>
               <w:br/>
-              <w:t>- Đã xây dựng phương án kiến trúc ứng dụng, cơ sở dữ liệu, API/tích hợp email–ADS-B–SLOT–AMHS–Bravo và phương án triển khai trên các máy chủ.</w:t>
+              <w:t>- Đã xây dựng nhóm cảnh báo–tiện ích và cập nhật các chức năng HTSLB về tìm kiếm, lưu trữ, phân loại, export, sửa/lưu lịch sử, đồng bộ liên ngày, thống kê,</w:t>
+            </w:r>
+            <w:r>
+              <w:rPr>
+                <w:sz w:val="22"/>
+              </w:rPr>
+              <w:t xml:space="preserve"> phép bay và đối chiếu Bravo.</w:t>
             </w:r>
             <w:r>
               <w:rPr>
                 <w:sz w:val="22"/>
               </w:rPr>
               <w:br/>
-              <w:t>- Đã thiết kế giao diện, luồng nghiệp vụ, mô hình dữ liệu, cấu trúc bảng/trường, dịch vụ, thông báo/cảnh báo, báo cáo và phân quyền.</w:t>
+              <w:t>- Đã xây dựng các biểu đồ/báo cáo, chỉ số ADS-B, báo cáo quân sự/dân dụng và các chức năng AI gồm truy vấn ngôn ngữ tự nhiên, tổng hợp tự động, Chatbot và giám sát hiệu năng.</w:t>
             </w:r>
             <w:r>
               <w:rPr>
                 <w:sz w:val="22"/>
               </w:rPr>
               <w:br/>
-              <w:t>- Đã tổ chức rà soát với Chủ đầu tư/đơn vị sử dụng; cập nhật các ý kiến và quản lý thay đổi so với phạm vi ban đầu.</w:t>
+              <w:t>- Đã cập nhật cấu trúc cơ sở dữ liệu, package/proce</w:t>
+            </w:r>
+            <w:r>
+              <w:rPr>
+                <w:sz w:val="22"/>
+              </w:rPr>
+              <w:t>dure/script, dữ liệu danh mục và các cấu hình ứng dụng liên quan.</w:t>
             </w:r>
             <w:r>
               <w:rPr>
                 <w:sz w:val="22"/>
               </w:rPr>
               <w:br/>
-              <w:t>- Đã xác định kế hoạch kiểm thử, dữ liệu kiểm thử, môi trường, điều kiện vào/ra và ma trận truy vết yêu cầu–thiết kế–kiểm thử.</w:t>
+              <w:t>- Đã thực hiện rà soát mã nguồn, kiểm thử đơn vị/tích hợp nội bộ, sửa lỗi và cập nhật tài liệu kỹ thuật theo từng bản build.</w:t>
             </w:r>
             <w:r>
               <w:rPr>
@@ -1366,48 +2098,52 @@
                 <w:sz w:val="22"/>
               </w:rPr>
               <w:br/>
-              <w:t>- Tài liệu đặc tả yêu cầu phần mềm (SRS); mã HTQLSLB-SRS-01; ngày 18/07/2026; phiên bản 1.0.</w:t>
+              <w:t>- Mã nguồn phần mềm Hệ thống số l</w:t>
+            </w:r>
+            <w:r>
+              <w:rPr>
+                <w:sz w:val="22"/>
+              </w:rPr>
+              <w:t>iệu điều hành bay; mã sản phẩm HTQLSLB-SRC-1.0.0; ngày đóng g</w:t>
+            </w:r>
+            <w:r>
+              <w:rPr>
+                <w:sz w:val="22"/>
+              </w:rPr>
+              <w:t>ói 02/08/2026; phiên bản 1.0.0.</w:t>
             </w:r>
             <w:r>
               <w:rPr>
                 <w:sz w:val="22"/>
               </w:rPr>
               <w:br/>
-              <w:t>- Tài liệu thiết kế chi tiết hệ thống; số 01/2026/TKCT-</w:t>
             </w:r>
             <w:r>
               <w:rPr>
                 <w:sz w:val="22"/>
               </w:rPr>
               <w:lastRenderedPageBreak/>
-              <w:t xml:space="preserve">HTQLSLB; </w:t>
-            </w:r>
-            <w:r>
-              <w:rPr>
-                <w:sz w:val="22"/>
-              </w:rPr>
-              <w:t>ngày 18/07/2026; phiên bản 1.0.</w:t>
+              <w:t>Tình trạng hoàn thành: Hoàn thành 100% ngày 02/08/2026, đúng mốc Ngày 25; mã nguồn, script, API và gói cài đặt phiên bản 1.0.0 đã được đóng gói và kiểm tra nội bộ.</w:t>
             </w:r>
             <w:r>
               <w:rPr>
                 <w:sz w:val="22"/>
               </w:rPr>
               <w:br/>
-              <w:t>Tình trạng hoàn thành: Hoàn thành 100% ngày 18/07/2026, đúng mốc Ngày 10; toàn bộ 05 nhóm/53 chức năng đã có yêu cầu, thiết kế và tiêu chí kiểm tra tương ứng.</w:t>
+              <w:t>Sự cố, sai khác, phát sinh và biện pháp xử lý: Các lỗi phát hiện khi rà soát mã nguồn, kiểm thử đơn vị và tích hợp nội bộ đã được cập nhật trong BCKTNB số 01/2026/BCKTNB-HTQLSLB và khắc phục trước khi bàn giao cài đặt.</w:t>
             </w:r>
             <w:r>
               <w:rPr>
                 <w:sz w:val="22"/>
               </w:rPr>
               <w:br/>
-              <w:t>Sự cố, sai khác, phát sinh và biện pháp xử lý: Không có sai khác ảnh hưởng phạm vi hoặc tiến độ. Các ý kiến rà soát về dữ liệu, phân quyền, tích hợp và tiêu chí báo cáo đã được cập nhật vào phiên bản 1.0 của các tài liệu.</w:t>
-            </w:r>
-            <w:r>
-              <w:rPr>
-                <w:sz w:val="22"/>
-              </w:rPr>
-              <w:br/>
-              <w:t>Đề nghị, kiến nghị và ý kiến giải quyết: Thống nhất chốt bộ tài liệu phiên bản 1.0 làm đường cơ sở để lập trình, quản lý thay đổi và kiểm thử.</w:t>
+              <w:t>Đề nghị, kiến nghị và ý kiến giải qu</w:t>
+            </w:r>
+            <w:r>
+              <w:rPr>
+                <w:sz w:val="22"/>
+              </w:rPr>
+              <w:t>yết: Xác nhận build HTQLSLB-BUILD-1.0.0 đủ điều kiện chuyển sang Giai đoạn 4; tiếp tục quản lý thay đổi bằng commit/tag và release notes.</w:t>
             </w:r>
           </w:p>
         </w:tc>
@@ -1437,7 +2173,6 @@
           <w:szCs w:val="24"/>
         </w:rPr>
       </w:pPr>
-      <w:bookmarkStart w:id="0" w:name="_GoBack"/>
       <w:r>
         <w:rPr>
           <w:rFonts w:ascii="Times New Roman" w:eastAsia="Times New Roman" w:hAnsi="Times New Roman"/>
@@ -1461,10 +2196,17 @@
           <w:sz w:val="24"/>
           <w:szCs w:val="24"/>
         </w:rPr>
-        <w:t>Hồ sơ kèm theo/đối chiếu: xem đầy đủ tên, mã/số, ngày và phiên bản tại mục Kết quả/sản phẩm đã hoàn thành trong bảng nhật ký.</w:t>
+        <w:t xml:space="preserve">Hồ sơ kèm theo/đối chiếu: xem đầy đủ tên, mã/số, ngày và phiên bản tại mục Kết </w:t>
+      </w:r>
+      <w:r>
+        <w:rPr>
+          <w:i/>
+          <w:sz w:val="24"/>
+          <w:szCs w:val="24"/>
+        </w:rPr>
+        <w:t>quả/sản phẩm đã hoàn thành trong bảng nhật ký.</w:t>
       </w:r>
     </w:p>
-    <w:bookmarkEnd w:id="0"/>
     <w:p>
       <w:r>
         <w:t>……………………………………………………………………………….…………………………………………………………………………………………</w:t>
@@ -1485,7 +2227,10 @@
     <w:p/>
     <w:p>
       <w:r>
-        <w:t>……………………………………………………………………………….…………………………………………………………………………………………</w:t>
+        <w:t>……………………</w:t>
+      </w:r>
+      <w:r>
+        <w:t>………………………………………………………….…………………………………………………………………………………………</w:t>
       </w:r>
     </w:p>
     <w:p/>
@@ -1494,11 +2239,66 @@
       <w:pPr>
         <w:spacing w:after="60"/>
         <w:jc w:val="right"/>
+        <w:rPr>
+          <w:sz w:val="24"/>
+        </w:rPr>
+      </w:pPr>
+    </w:p>
+    <w:p>
+      <w:pPr>
+        <w:spacing w:after="60"/>
+        <w:jc w:val="right"/>
+        <w:rPr>
+          <w:sz w:val="24"/>
+        </w:rPr>
+      </w:pPr>
+    </w:p>
+    <w:p>
+      <w:pPr>
+        <w:spacing w:after="60"/>
+        <w:jc w:val="right"/>
+        <w:rPr>
+          <w:sz w:val="24"/>
+        </w:rPr>
+      </w:pPr>
+    </w:p>
+    <w:p>
+      <w:pPr>
+        <w:spacing w:after="60"/>
+        <w:jc w:val="right"/>
+        <w:rPr>
+          <w:sz w:val="24"/>
+        </w:rPr>
+      </w:pPr>
+    </w:p>
+    <w:p>
+      <w:pPr>
+        <w:spacing w:after="60"/>
+        <w:jc w:val="right"/>
+        <w:rPr>
+          <w:sz w:val="24"/>
+        </w:rPr>
+      </w:pPr>
+    </w:p>
+    <w:p>
+      <w:pPr>
+        <w:spacing w:after="60"/>
+        <w:jc w:val="right"/>
+        <w:rPr>
+          <w:sz w:val="24"/>
+        </w:rPr>
+      </w:pPr>
+    </w:p>
+    <w:p>
+      <w:pPr>
+        <w:spacing w:after="60"/>
+        <w:jc w:val="right"/>
       </w:pPr>
       <w:r>
         <w:rPr>
           <w:sz w:val="24"/>
         </w:rPr>
+        <w:lastRenderedPageBreak/>
         <w:t>Mẫu số 1.1. Nội dung ghi nhật ký công tác triển khai</w:t>
       </w:r>
     </w:p>
@@ -1537,7 +2337,7 @@
           <w:sz w:val="24"/>
           <w:szCs w:val="24"/>
         </w:rPr>
-        <w:t>Giai đoạn 3 – Lập trình, cập nhật và hiệu chỉnh phần mềm</w:t>
+        <w:t>Giai đoạn 4 – Cài đặt, kiểm thử nội bộ và bàn giao kiểm thử</w:t>
       </w:r>
     </w:p>
     <w:p>
@@ -1564,7 +2364,14 @@
           <w:sz w:val="24"/>
           <w:szCs w:val="24"/>
         </w:rPr>
-        <w:t>Công việc: Cài đặt, cập nhật, hiệu chỉnh cơ sở dữ liệu, phần mềm Hệ thống số liệu điều hành bay</w:t>
+        <w:t xml:space="preserve">Công việc: Cài đặt, cập nhật, hiệu chỉnh cơ </w:t>
+      </w:r>
+      <w:r>
+        <w:rPr>
+          <w:sz w:val="24"/>
+          <w:szCs w:val="24"/>
+        </w:rPr>
+        <w:t>sở dữ liệu, phần mềm Hệ thống số liệu điều hành bay</w:t>
       </w:r>
     </w:p>
     <w:p>
@@ -1720,14 +2527,21 @@
                 <w:b/>
                 <w:sz w:val="22"/>
               </w:rPr>
-              <w:t>Ý kiến và chữ ký xác nhận của đại diện đơn vị giám sát công tác triển khai (nếu có) đ</w:t>
+              <w:t>Ý kiến và chữ ký xác nhận của đại diện đơn vị giám sát công tác triển khai (nếu có) đố</w:t>
             </w:r>
             <w:r>
               <w:rPr>
                 <w:b/>
                 <w:sz w:val="22"/>
               </w:rPr>
-              <w:t>ối với các nội dung triển khai.</w:t>
+              <w:t>i với các nội dung triển khai.</w:t>
+            </w:r>
+            <w:r>
+              <w:rPr>
+                <w:b/>
+                <w:sz w:val="22"/>
+              </w:rPr>
+              <w:br/>
             </w:r>
           </w:p>
         </w:tc>
@@ -1752,7 +2566,7 @@
               <w:rPr>
                 <w:sz w:val="22"/>
               </w:rPr>
-              <w:t>3</w:t>
+              <w:t>4</w:t>
             </w:r>
           </w:p>
         </w:tc>
@@ -1772,21 +2586,21 @@
               <w:rPr>
                 <w:sz w:val="22"/>
               </w:rPr>
-              <w:t>Ngày 8 – 25</w:t>
+              <w:t>Ngày 25 – 30</w:t>
             </w:r>
             <w:r>
               <w:rPr>
                 <w:sz w:val="22"/>
               </w:rPr>
               <w:br/>
-              <w:t>Từ: 16/07/2026</w:t>
+              <w:t>Từ: 02/08/2026</w:t>
             </w:r>
             <w:r>
               <w:rPr>
                 <w:sz w:val="22"/>
               </w:rPr>
               <w:br/>
-              <w:t>Đến: 02/08/2026</w:t>
+              <w:t>Đến: 07/08/2026</w:t>
             </w:r>
           </w:p>
         </w:tc>
@@ -1805,7 +2619,7 @@
               <w:rPr>
                 <w:sz w:val="22"/>
               </w:rPr>
-              <w:t>Giai đoạn 3 – Lập trình, cập nhật và hiệu chỉnh phần mềm</w:t>
+              <w:t>Giai đoạn 4 – Cài đặt, kiểm thử nội bộ và bàn giao kiểm thử</w:t>
             </w:r>
             <w:r>
               <w:rPr>
@@ -1819,42 +2633,60 @@
                 <w:sz w:val="22"/>
               </w:rPr>
               <w:br/>
-              <w:t>- Đã thiết lập nhánh/mốc quản lý phiên bản, môi trường phát triển và quy ước xây dựng, đóng gói, kiểm soát thay đổi mã nguồn.</w:t>
+              <w:t>- Đã kiểm tra điều kiện môi trường, tài nguyên, kết nối mạng, tài khoản và bản sao lưu trước khi triển khai.</w:t>
             </w:r>
             <w:r>
               <w:rPr>
                 <w:sz w:val="22"/>
               </w:rPr>
               <w:br/>
-              <w:t>- Đã lập trình các chức năng tích hợp và tự động hóa dữ liệu: email/thư mục, ADS-B, SLOT, AMHS, Gateway/API và xử lý lỗi tích hợp.</w:t>
+              <w:t>- Đã cài</w:t>
+            </w:r>
+            <w:r>
+              <w:rPr>
+                <w:sz w:val="22"/>
+              </w:rPr>
+              <w:t xml:space="preserve"> đặt phần mềm hệ thống/phần mềm nền, cơ sở dữ liệu, middleware/runtime và phần mềm nội bộ trên các máy chủ theo thiết kế.</w:t>
             </w:r>
             <w:r>
               <w:rPr>
                 <w:sz w:val="22"/>
               </w:rPr>
               <w:br/>
-              <w:t>- Đã xây dựng nhóm cảnh báo–tiện ích và cập nhật các chức năng HTSLB về tìm kiếm, lưu trữ, phân loại, export, sửa/lưu lịch sử, đồng bộ liên ngày, thống kê, phép bay và đối chiếu Bravo.</w:t>
+              <w:t>- Đã cấu hình địa chỉ/cổng dịch vụ, kết nối cơ sở dữ liệu và tích hợp, tài khoản/phân quyền, log, đồng bộ thời gian, giám sát, sao lưu</w:t>
+            </w:r>
+            <w:r>
+              <w:rPr>
+                <w:sz w:val="22"/>
+              </w:rPr>
+              <w:t xml:space="preserve"> và khôi phục.</w:t>
             </w:r>
             <w:r>
               <w:rPr>
                 <w:sz w:val="22"/>
               </w:rPr>
               <w:br/>
-              <w:t>- Đã xây dựng các biểu đồ/báo cáo, chỉ số ADS-B, báo cáo quân sự/dân dụng và các chức năng AI gồm truy vấn ngôn ngữ tự nhiên, tổng hợp tự động, Chatbot và giám sát hiệu năng.</w:t>
+              <w:t>- Đã triển khai script cơ sở dữ liệu và gói ứng dụng; kiểm tra khởi động dịch vụ, kết nối giữa các thành phần, truy cập ứng dụng và ghi nhận phiên bản.</w:t>
             </w:r>
             <w:r>
               <w:rPr>
                 <w:sz w:val="22"/>
               </w:rPr>
               <w:br/>
-              <w:t>- Đã cập nhật cấu trúc cơ sở dữ liệu, package/procedure/script, dữ liệu danh mục và các cấu hình ứng dụng liên quan.</w:t>
+              <w:t>- Đã chuẩn bị dữ liệu kiểm thử, thực hiện kiểm thử nội bộ theo chức năng và yêu cầu phi c</w:t>
+            </w:r>
+            <w:r>
+              <w:rPr>
+                <w:sz w:val="22"/>
+              </w:rPr>
+              <w:t>hức năng; tiếp nhận và khắc phục lỗi.</w:t>
             </w:r>
             <w:r>
               <w:rPr>
                 <w:sz w:val="22"/>
               </w:rPr>
               <w:br/>
-              <w:t>- Đã thực hiện rà soát mã nguồn, kiểm thử đơn vị/tích hợp nội bộ, sửa lỗi và cập nhật tài liệu kỹ thuật theo từng bản build.</w:t>
+              <w:t>- Đã đóng gói phiên bản đủ điều kiện bàn giao cho Chủ đầu tư/đơn vị kiểm thử và thống nhất phạm vi, dữ liệu, tài khoản kiểm thử.</w:t>
             </w:r>
             <w:r>
               <w:rPr>
@@ -1868,41 +2700,59 @@
                 <w:sz w:val="22"/>
               </w:rPr>
               <w:br/>
-              <w:t xml:space="preserve">- Mã nguồn phần mềm Hệ thống số liệu điều hành bay; </w:t>
+              <w:t>- Biên bản nghiệm thu kỹ thuật cài đặt phần mềm hệ thống,</w:t>
+            </w:r>
+            <w:r>
+              <w:rPr>
+                <w:sz w:val="22"/>
+              </w:rPr>
+              <w:t xml:space="preserve"> phần mềm nội bộ và cấu hình máy chủ; số 01/2026/BBNTKT-HTQLSLB; ngày 07/08/2026; phiên </w:t>
+            </w:r>
+            <w:r>
+              <w:rPr>
+                <w:sz w:val="22"/>
+              </w:rPr>
+              <w:t>bản hồ sơ 1.0.</w:t>
+            </w:r>
+            <w:r>
+              <w:rPr>
+                <w:sz w:val="22"/>
+              </w:rPr>
+              <w:br/>
+              <w:t xml:space="preserve">Tình trạng hoàn thành: Hoàn thành 100% ngày </w:t>
             </w:r>
             <w:r>
               <w:rPr>
                 <w:sz w:val="22"/>
               </w:rPr>
               <w:lastRenderedPageBreak/>
-              <w:t>mã sản phẩm HTQLSLB-SRC-1.0.0; ngày đóng g</w:t>
-            </w:r>
-            <w:r>
-              <w:rPr>
-                <w:sz w:val="22"/>
-              </w:rPr>
-              <w:t>ói 02/08/2026; phiên bản 1.0.0.</w:t>
+              <w:t>07/08/2026, đúng mốc Ngày 30; phần mềm hệ thống, phần mềm nội bộ và cấu hình máy chủ đã được cài đặt, kiểm tr</w:t>
+            </w:r>
+            <w:r>
+              <w:rPr>
+                <w:sz w:val="22"/>
+              </w:rPr>
+              <w:t>a và bàn giao phiên bản RC1.</w:t>
             </w:r>
             <w:r>
               <w:rPr>
                 <w:sz w:val="22"/>
               </w:rPr>
               <w:br/>
-              <w:t>Tình trạng hoàn thành: Hoàn thành 100% ngày 02/08/2026, đúng mốc Ngày 25; mã nguồn, script, API và gói cài đặt phiên bản 1.0.0 đã được đóng gói và kiểm tra nội bộ.</w:t>
+              <w:t>Sự cố, sai khác, phát sinh và biện pháp xử lý: Không có sự cố làm gián đoạn tiến độ. Các lỗi cấu hình/kết nối phát hiện trong kiểm tra nội bộ đã được ghi tại HTQLSLB-DEFECT-INT-01, khắc phục và kiểm thử lại đạt yêu cầu.</w:t>
             </w:r>
             <w:r>
               <w:rPr>
                 <w:sz w:val="22"/>
               </w:rPr>
               <w:br/>
-              <w:t>Sự cố, sai khác, phát sinh và biện pháp xử lý: Các lỗi phát hiện khi rà soát mã nguồn, kiểm thử đơn vị và tích hợp nội bộ đã được cập nhật trong BCKTNB số 01/2026/BCKTNB-HTQLSLB và khắc phục trước khi bàn giao cài đặt.</w:t>
-            </w:r>
-            <w:r>
-              <w:rPr>
-                <w:sz w:val="22"/>
-              </w:rPr>
-              <w:br/>
-              <w:t>Đề nghị, kiến nghị và ý kiến giải quyết: Xác nhận build HTQLSLB-BUILD-1.0.0 đủ điều kiện chuyển sang Giai đoạn 4; tiếp tục quản lý thay đổi bằng commit/tag và release notes.</w:t>
+              <w:t>Đề nghị</w:t>
+            </w:r>
+            <w:r>
+              <w:rPr>
+                <w:sz w:val="22"/>
+              </w:rPr>
+              <w:t>, kiến nghị và ý kiến giải quyết: Các bên thống nhất môi trường, tài khoản, dữ liệu và build HTQLSLB-1.0.0-RC1 đủ điều kiện thực hiện kiểm thử hệ thống.</w:t>
             </w:r>
           </w:p>
         </w:tc>
@@ -1932,7 +2782,6 @@
           <w:szCs w:val="24"/>
         </w:rPr>
       </w:pPr>
-      <w:bookmarkStart w:id="0" w:name="_GoBack"/>
       <w:r>
         <w:rPr>
           <w:rFonts w:ascii="Times New Roman" w:eastAsia="Times New Roman" w:hAnsi="Times New Roman"/>
@@ -1956,44 +2805,188 @@
           <w:sz w:val="24"/>
           <w:szCs w:val="24"/>
         </w:rPr>
-        <w:t>Hồ sơ kèm theo/đối chiếu: xem đầy đủ tên, mã/số, ngày và phiên bản tại mục Kết quả/sản phẩm đã hoàn thành trong bảng nhật ký.</w:t>
+        <w:t xml:space="preserve">Hồ sơ kèm theo/đối chiếu: xem đầy đủ tên, mã/số, ngày và phiên bản </w:t>
+      </w:r>
+      <w:r>
+        <w:rPr>
+          <w:i/>
+          <w:sz w:val="24"/>
+          <w:szCs w:val="24"/>
+        </w:rPr>
+        <w:t>tại mục Kết quả/sản phẩm đã hoàn thành trong bảng nhật ký.</w:t>
       </w:r>
     </w:p>
-    <w:bookmarkEnd w:id="0"/>
     <w:p>
+      <w:pPr>
+        <w:rPr>
+          <w:sz w:val="24"/>
+          <w:szCs w:val="24"/>
+        </w:rPr>
+      </w:pPr>
       <w:r>
-        <w:t>……………………………………………………………………………….…………………………………………………………………………………………</w:t>
+        <w:rPr>
+          <w:sz w:val="24"/>
+          <w:szCs w:val="24"/>
+        </w:rPr>
+        <w:t>……………………………………………………………………………….……………………………………………………………</w:t>
       </w:r>
     </w:p>
-    <w:p/>
     <w:p>
+      <w:pPr>
+        <w:rPr>
+          <w:sz w:val="24"/>
+          <w:szCs w:val="24"/>
+        </w:rPr>
+      </w:pPr>
+    </w:p>
+    <w:p>
+      <w:pPr>
+        <w:rPr>
+          <w:sz w:val="24"/>
+          <w:szCs w:val="24"/>
+        </w:rPr>
+      </w:pPr>
       <w:r>
-        <w:t>……………………………………………………………………………….…………………………………………………………………………………………</w:t>
+        <w:rPr>
+          <w:sz w:val="24"/>
+          <w:szCs w:val="24"/>
+        </w:rPr>
+        <w:t>……………………………………………………………………………….……………………………………………………………</w:t>
       </w:r>
     </w:p>
-    <w:p/>
     <w:p>
+      <w:pPr>
+        <w:rPr>
+          <w:sz w:val="24"/>
+          <w:szCs w:val="24"/>
+        </w:rPr>
+      </w:pPr>
+    </w:p>
+    <w:p>
+      <w:pPr>
+        <w:rPr>
+          <w:sz w:val="24"/>
+          <w:szCs w:val="24"/>
+        </w:rPr>
+      </w:pPr>
       <w:r>
-        <w:t>……………………………………………………………………………….…………………………………………………………………………………………</w:t>
+        <w:rPr>
+          <w:sz w:val="24"/>
+          <w:szCs w:val="24"/>
+        </w:rPr>
+        <w:t>……………………………………………………………………………….……………………………………………………………</w:t>
       </w:r>
     </w:p>
-    <w:p/>
     <w:p>
+      <w:pPr>
+        <w:rPr>
+          <w:sz w:val="24"/>
+          <w:szCs w:val="24"/>
+        </w:rPr>
+      </w:pPr>
+    </w:p>
+    <w:p>
+      <w:pPr>
+        <w:rPr>
+          <w:sz w:val="24"/>
+          <w:szCs w:val="24"/>
+        </w:rPr>
+      </w:pPr>
       <w:r>
-        <w:t>……………………………………………………………………………….…………………………………………………………………………………………</w:t>
+        <w:rPr>
+          <w:sz w:val="24"/>
+          <w:szCs w:val="24"/>
+        </w:rPr>
+        <w:t>……………………………………………………………………………</w:t>
+      </w:r>
+      <w:r>
+        <w:rPr>
+          <w:sz w:val="24"/>
+          <w:szCs w:val="24"/>
+        </w:rPr>
+        <w:t>….……………………………………………………………</w:t>
       </w:r>
     </w:p>
-    <w:p/>
-    <w:p/>
+    <w:p>
+      <w:pPr>
+        <w:rPr>
+          <w:sz w:val="24"/>
+          <w:szCs w:val="24"/>
+        </w:rPr>
+      </w:pPr>
+    </w:p>
+    <w:p>
+      <w:pPr>
+        <w:rPr>
+          <w:sz w:val="24"/>
+          <w:szCs w:val="24"/>
+        </w:rPr>
+      </w:pPr>
+    </w:p>
     <w:p>
       <w:pPr>
         <w:spacing w:after="60"/>
         <w:jc w:val="right"/>
+        <w:rPr>
+          <w:sz w:val="24"/>
+        </w:rPr>
+      </w:pPr>
+    </w:p>
+    <w:p>
+      <w:pPr>
+        <w:spacing w:after="60"/>
+        <w:jc w:val="right"/>
+        <w:rPr>
+          <w:sz w:val="24"/>
+        </w:rPr>
+      </w:pPr>
+    </w:p>
+    <w:p>
+      <w:pPr>
+        <w:spacing w:after="60"/>
+        <w:jc w:val="right"/>
+        <w:rPr>
+          <w:sz w:val="24"/>
+        </w:rPr>
+      </w:pPr>
+    </w:p>
+    <w:p>
+      <w:pPr>
+        <w:spacing w:after="60"/>
+        <w:jc w:val="right"/>
+        <w:rPr>
+          <w:sz w:val="24"/>
+        </w:rPr>
+      </w:pPr>
+    </w:p>
+    <w:p>
+      <w:pPr>
+        <w:spacing w:after="60"/>
+        <w:jc w:val="right"/>
+        <w:rPr>
+          <w:sz w:val="24"/>
+        </w:rPr>
+      </w:pPr>
+    </w:p>
+    <w:p>
+      <w:pPr>
+        <w:spacing w:after="60"/>
+        <w:jc w:val="right"/>
+        <w:rPr>
+          <w:sz w:val="24"/>
+        </w:rPr>
+      </w:pPr>
+    </w:p>
+    <w:p>
+      <w:pPr>
+        <w:spacing w:after="60"/>
+        <w:jc w:val="right"/>
       </w:pPr>
       <w:r>
         <w:rPr>
           <w:sz w:val="24"/>
         </w:rPr>
+        <w:lastRenderedPageBreak/>
         <w:t>Mẫu số 1.1. Nội dung ghi nhật ký công tác triển khai</w:t>
       </w:r>
     </w:p>
@@ -2032,7 +3025,7 @@
           <w:sz w:val="24"/>
           <w:szCs w:val="24"/>
         </w:rPr>
-        <w:t>Giai đoạn 4 – Cài đặt, kiểm thử nội bộ và bàn giao kiểm thử</w:t>
+        <w:t>Giai đoạn 5 – Phối hợp kiểm thử hệ thống và hoàn thiện phần mềm</w:t>
       </w:r>
     </w:p>
     <w:p>
@@ -2059,7 +3052,14 @@
           <w:sz w:val="24"/>
           <w:szCs w:val="24"/>
         </w:rPr>
-        <w:t>Công việc: Cài đặt, cập nhật, hiệu chỉnh cơ sở dữ liệu, phần mềm Hệ thống số liệu điều hành bay</w:t>
+        <w:t>Công việc: Cài đặt, cập nhật, hiệu chỉnh cơ sở dữ liệu, phần mềm Hệ thống</w:t>
+      </w:r>
+      <w:r>
+        <w:rPr>
+          <w:sz w:val="24"/>
+          <w:szCs w:val="24"/>
+        </w:rPr>
+        <w:t xml:space="preserve"> số liệu điều hành bay</w:t>
       </w:r>
     </w:p>
     <w:p>
@@ -2215,21 +3215,14 @@
                 <w:b/>
                 <w:sz w:val="22"/>
               </w:rPr>
-              <w:t>Ý kiến và chữ ký xác nhận của đại diện đơn vị giám sát công tác triển khai (nếu có) đố</w:t>
+              <w:t>Ý kiến và chữ ký xác nhận của đại diện đơn vị giám sát công tác triển khai (nếu có) đ</w:t>
             </w:r>
             <w:r>
               <w:rPr>
                 <w:b/>
                 <w:sz w:val="22"/>
               </w:rPr>
-              <w:t>i với các nội dung triển khai.</w:t>
-            </w:r>
-            <w:r>
-              <w:rPr>
-                <w:b/>
-                <w:sz w:val="22"/>
-              </w:rPr>
-              <w:br/>
+              <w:t>ối với các nội dung triển khai.</w:t>
             </w:r>
           </w:p>
         </w:tc>
@@ -2254,7 +3247,7 @@
               <w:rPr>
                 <w:sz w:val="22"/>
               </w:rPr>
-              <w:t>4</w:t>
+              <w:t>5</w:t>
             </w:r>
           </w:p>
         </w:tc>
@@ -2274,21 +3267,21 @@
               <w:rPr>
                 <w:sz w:val="22"/>
               </w:rPr>
-              <w:t>Ngày 25 – 30</w:t>
+              <w:t>Ngày 32 – 48</w:t>
             </w:r>
             <w:r>
               <w:rPr>
                 <w:sz w:val="22"/>
               </w:rPr>
               <w:br/>
-              <w:t>Từ: 02/08/2026</w:t>
+              <w:t>Từ: 09/08/2026</w:t>
             </w:r>
             <w:r>
               <w:rPr>
                 <w:sz w:val="22"/>
               </w:rPr>
               <w:br/>
-              <w:t>Đến: 07/08/2026</w:t>
+              <w:t>Đến: 25/08/2026</w:t>
             </w:r>
           </w:p>
         </w:tc>
@@ -2307,7 +3300,7 @@
               <w:rPr>
                 <w:sz w:val="22"/>
               </w:rPr>
-              <w:t>Giai đoạn 4 – Cài đặt, kiểm thử nội bộ và bàn giao kiểm thử</w:t>
+              <w:t>Giai đoạn 5 – Phối hợp kiểm thử hệ thống và hoàn thiện phần mềm</w:t>
             </w:r>
             <w:r>
               <w:rPr>
@@ -2321,60 +3314,60 @@
                 <w:sz w:val="22"/>
               </w:rPr>
               <w:br/>
-              <w:t xml:space="preserve">- Đã kiểm tra điều kiện môi trường, tài nguyên, kết nối mạng, </w:t>
-            </w:r>
-            <w:r>
-              <w:rPr>
-                <w:sz w:val="22"/>
-              </w:rPr>
-              <w:t>tài khoản và bản sao lưu trước khi triển khai.</w:t>
+              <w:t>- Đã phối hợp chuẩn bị môi trường, tài khoản, dữ liệu và bộ kịch bản kiểm thử cho đầy đủ phạm vi 05 nhóm/53 chức năng.</w:t>
             </w:r>
             <w:r>
               <w:rPr>
                 <w:sz w:val="22"/>
               </w:rPr>
               <w:br/>
-              <w:t>- Đã cài đặt phần mềm hệ thống/phần mềm nền, cơ sở dữ liệu, middleware/runtime và phần mềm nội bộ trên các máy chủ theo thiết kế.</w:t>
+              <w:t>- Đã thực hiện/ hỗ trợ k</w:t>
+            </w:r>
+            <w:r>
+              <w:rPr>
+                <w:sz w:val="22"/>
+              </w:rPr>
+              <w:t>iểm thử chức năng, tích hợp, dữ liệu, phân quyền, báo cáo, cảnh báo, hiệu năng và các yêu cầu an toàn–lưu vết theo kế hoạch.</w:t>
             </w:r>
             <w:r>
               <w:rPr>
                 <w:sz w:val="22"/>
               </w:rPr>
               <w:br/>
-              <w:t>- Đã cấu hình địa chỉ/cổng dịch vụ, kết nối cơ sở dữ liệu và tích hợp, tài khoả</w:t>
-            </w:r>
-            <w:r>
-              <w:rPr>
-                <w:sz w:val="22"/>
-              </w:rPr>
-              <w:t>n/phân quyền, log, đồng bộ thời gian, giám sát, sao lưu và khôi phục.</w:t>
+              <w:t>- Đã ghi nhận kết quả từng ca kiểm thử và bằng chứng; phân loại lỗi theo mức độ, xác định nguyên nhân, trách nhiệm và thời hạn khắc</w:t>
+            </w:r>
+            <w:r>
+              <w:rPr>
+                <w:sz w:val="22"/>
+              </w:rPr>
+              <w:t xml:space="preserve"> phục.</w:t>
             </w:r>
             <w:r>
               <w:rPr>
                 <w:sz w:val="22"/>
               </w:rPr>
               <w:br/>
-              <w:t>- Đã triển khai script cơ sở dữ liệu và gói ứng dụng; kiểm tra khởi động dịch vụ, kết nối giữa các thành phần, truy cập ứng dụng và ghi nhận phiên bản.</w:t>
+              <w:t>- Đã sửa lỗi, cập nhật mã nguồn/script/cấu hình, phát hành build mới và phối hợp kiểm thử lại đến khi đóng lỗi hoặc thống nhất tồn tại.</w:t>
             </w:r>
             <w:r>
               <w:rPr>
                 <w:sz w:val="22"/>
               </w:rPr>
               <w:br/>
-              <w:t>- Đã chuẩn bị dữ liệu kiểm thử, th</w:t>
-            </w:r>
-            <w:r>
-              <w:rPr>
-                <w:sz w:val="22"/>
-              </w:rPr>
-              <w:t>ực hiện kiểm thử nội bộ theo chức năng và yêu cầu phi chức năng; tiếp nhận và khắc phục lỗi.</w:t>
+              <w:t>- Đã đối chiếu kết quả với yêu cầu, thiết kế chi tiết và tiêu chí chấp nhận; cập nhật ma trận truy vết và hồ sơ t</w:t>
+            </w:r>
+            <w:r>
+              <w:rPr>
+                <w:sz w:val="22"/>
+              </w:rPr>
+              <w:t>hay đổi.</w:t>
             </w:r>
             <w:r>
               <w:rPr>
                 <w:sz w:val="22"/>
               </w:rPr>
               <w:br/>
-              <w:t>- Đã đóng gói phiên bản đủ điều kiện bàn giao cho Chủ đầu tư/đơn vị kiểm thử và thống nhất phạm vi, dữ liệu, tài khoản kiểm thử.</w:t>
+              <w:t>- Đã hoàn thiện phiên bản phát hành dự kiến, tài liệu người dùng/quản trị và danh mục vấn đề còn lại để trình xem xét.</w:t>
             </w:r>
             <w:r>
               <w:rPr>
@@ -2388,53 +3381,66 @@
                 <w:sz w:val="22"/>
               </w:rPr>
               <w:br/>
-              <w:t xml:space="preserve">- </w:t>
-            </w:r>
-            <w:r>
-              <w:rPr>
-                <w:sz w:val="22"/>
-              </w:rPr>
-              <w:t xml:space="preserve">Biên bản nghiệm thu kỹ thuật cài đặt phần mềm hệ thống, phần mềm nội bộ và cấu hình máy chủ; số 01/2026/BBNTKT-HTQLSLB; ngày 07/08/2026; phiên </w:t>
+              <w:t xml:space="preserve">- Báo cáo kiểm thử hệ thống/UAT; số 01/2026/BCKTHT-HTQLSLB; </w:t>
+            </w:r>
+            <w:r>
+              <w:rPr>
+                <w:sz w:val="22"/>
+              </w:rPr>
+              <w:t>ngày 25/08/2026; phiên bản 1.0.</w:t>
+            </w:r>
+            <w:r>
+              <w:rPr>
+                <w:sz w:val="22"/>
+              </w:rPr>
+              <w:br/>
+              <w:t>- Bi</w:t>
+            </w:r>
+            <w:r>
+              <w:rPr>
+                <w:sz w:val="22"/>
+              </w:rPr>
+              <w:t xml:space="preserve">ên bản xác nhận đủ điều kiện triển khai chính thức; số 01/2026/BBDK-HTQLSLB; ngày 25/08/2026; phiên </w:t>
             </w:r>
             <w:r>
               <w:rPr>
                 <w:sz w:val="22"/>
               </w:rPr>
               <w:lastRenderedPageBreak/>
-              <w:t>bản hồ sơ 1.0.</w:t>
+              <w:t>bản 1.0.</w:t>
             </w:r>
             <w:r>
               <w:rPr>
                 <w:sz w:val="22"/>
               </w:rPr>
               <w:br/>
-              <w:t>Tình trạng hoàn thành: Hoàn thành 100% ngày 07/08/2026, đúng mốc Ngày 30; p</w:t>
-            </w:r>
-            <w:r>
-              <w:rPr>
-                <w:sz w:val="22"/>
-              </w:rPr>
-              <w:t>hần mềm hệ thống, phần mềm nội bộ và cấu hình máy chủ đã được cài đặt, kiểm tra và bàn giao phiên bản RC1.</w:t>
+              <w:t xml:space="preserve">Tình trạng hoàn thành: Hoàn thành 100% ngày 25/08/2026, đúng mốc Ngày 48; 53 chức năng đã được kiểm tra, các lỗi ảnh hưởng nghiệm thu đã được khắc </w:t>
+            </w:r>
+            <w:r>
+              <w:rPr>
+                <w:sz w:val="22"/>
+              </w:rPr>
+              <w:t>phục và xác nhận lại.</w:t>
             </w:r>
             <w:r>
               <w:rPr>
                 <w:sz w:val="22"/>
               </w:rPr>
               <w:br/>
-              <w:t>Sự cố, sai khác, phát sinh và biện pháp xử lý: Không có sự cố làm gián đoạn tiến độ. Các lỗi cấu hình/kết nối phát hiện trong kiểm tra nội bộ đã được</w:t>
-            </w:r>
-            <w:r>
-              <w:rPr>
-                <w:sz w:val="22"/>
-              </w:rPr>
-              <w:t xml:space="preserve"> ghi tại HTQLSLB-DEFECT-INT-01, khắc phục và kiểm thử lại đạt yêu cầu.</w:t>
+              <w:t>Sự cố, sai khác, phát sinh và biện pháp xử lý: Các lỗi và ý kiến UAT đã được quản lý trong HTQLSLB-DEFECT-UAT-01. Không còn lỗi nghiêm trọng hoặc lỗi cản trở triển khai chính thức tại thời điểm chốt báo cáo.</w:t>
             </w:r>
             <w:r>
               <w:rPr>
                 <w:sz w:val="22"/>
               </w:rPr>
               <w:br/>
-              <w:t>Đề nghị, kiến nghị và ý kiến giải quyết: Các bên thống nhất môi trường, tài khoản, dữ liệu và build HTQLSLB-1.0.0-RC1 đủ điều kiện thực hiện kiểm thử hệ thống.</w:t>
+              <w:t>Đề nghị, kiến nghị và ý ki</w:t>
+            </w:r>
+            <w:r>
+              <w:rPr>
+                <w:sz w:val="22"/>
+              </w:rPr>
+              <w:t>ến giải quyết: Thống nhất sử dụng phiên bản HTQLSLB-1.0.0-RC2 làm cơ sở đào tạo, chuyển giao và phát hành phiên bản chính thức.</w:t>
             </w:r>
           </w:p>
         </w:tc>
@@ -2487,113 +3493,101 @@
           <w:sz w:val="24"/>
           <w:szCs w:val="24"/>
         </w:rPr>
-        <w:t>Hồ sơ kèm theo/đối chiếu: xem đầy đủ tên, mã/số, ngày và phiên bản tại mục Kết quả/sản phẩm đã hoàn thành trong bảng nhật ký.</w:t>
+        <w:t>Hồ sơ kèm theo/đối chiếu: xem đầy đủ tên, mã/số, ngày và phiên bản tại mục Kết quả/sản phẩm đã</w:t>
+      </w:r>
+      <w:r>
+        <w:rPr>
+          <w:i/>
+          <w:sz w:val="24"/>
+          <w:szCs w:val="24"/>
+        </w:rPr>
+        <w:t xml:space="preserve"> hoàn thành trong bảng nhật ký.</w:t>
       </w:r>
     </w:p>
     <w:p>
-      <w:pPr>
-        <w:rPr>
-          <w:sz w:val="24"/>
-          <w:szCs w:val="24"/>
-        </w:rPr>
-      </w:pPr>
       <w:r>
-        <w:rPr>
-          <w:sz w:val="24"/>
-          <w:szCs w:val="24"/>
-        </w:rPr>
-        <w:t>……………………………………………………………………………….……………………………………………………………</w:t>
+        <w:t>……………………………………………………………………………….…………………………………………………………………………………………</w:t>
       </w:r>
     </w:p>
+    <w:p/>
     <w:p>
-      <w:pPr>
+      <w:r>
+        <w:t>……………………………………………………………………………….…………………………………………………………………………………………</w:t>
+      </w:r>
+    </w:p>
+    <w:p/>
+    <w:p>
+      <w:r>
+        <w:t>……………………………………………………………………………….…………………………………………………………………………………………</w:t>
+      </w:r>
+    </w:p>
+    <w:p/>
+    <w:p>
+      <w:r>
+        <w:t>……………………………………………………………</w:t>
+      </w:r>
+      <w:r>
+        <w:t>………………….…………………………………………………………………………………………</w:t>
+      </w:r>
+    </w:p>
+    <w:p/>
+    <w:p/>
+    <w:p>
+      <w:pPr>
+        <w:spacing w:after="60"/>
+        <w:jc w:val="right"/>
         <w:rPr>
           <w:sz w:val="24"/>
-          <w:szCs w:val="24"/>
         </w:rPr>
       </w:pPr>
     </w:p>
     <w:p>
       <w:pPr>
+        <w:spacing w:after="60"/>
+        <w:jc w:val="right"/>
         <w:rPr>
           <w:sz w:val="24"/>
-          <w:szCs w:val="24"/>
-        </w:rPr>
-      </w:pPr>
-      <w:r>
-        <w:rPr>
-          <w:sz w:val="24"/>
-          <w:szCs w:val="24"/>
-        </w:rPr>
-        <w:t>……………………………………………………………………………….……………………………………………………………</w:t>
-      </w:r>
+        </w:rPr>
+      </w:pPr>
     </w:p>
     <w:p>
       <w:pPr>
+        <w:spacing w:after="60"/>
+        <w:jc w:val="right"/>
         <w:rPr>
           <w:sz w:val="24"/>
-          <w:szCs w:val="24"/>
         </w:rPr>
       </w:pPr>
     </w:p>
     <w:p>
       <w:pPr>
+        <w:spacing w:after="60"/>
+        <w:jc w:val="right"/>
         <w:rPr>
           <w:sz w:val="24"/>
-          <w:szCs w:val="24"/>
-        </w:rPr>
-      </w:pPr>
-      <w:r>
-        <w:rPr>
-          <w:sz w:val="24"/>
-          <w:szCs w:val="24"/>
-        </w:rPr>
-        <w:t>……………………………………………………………………………….……………………………………………………………</w:t>
-      </w:r>
+        </w:rPr>
+      </w:pPr>
     </w:p>
     <w:p>
       <w:pPr>
+        <w:spacing w:after="60"/>
+        <w:jc w:val="right"/>
         <w:rPr>
           <w:sz w:val="24"/>
-          <w:szCs w:val="24"/>
         </w:rPr>
       </w:pPr>
     </w:p>
     <w:p>
       <w:pPr>
+        <w:spacing w:after="60"/>
+        <w:jc w:val="right"/>
         <w:rPr>
           <w:sz w:val="24"/>
-          <w:szCs w:val="24"/>
-        </w:rPr>
-      </w:pPr>
-      <w:r>
-        <w:rPr>
-          <w:sz w:val="24"/>
-          <w:szCs w:val="24"/>
-        </w:rPr>
-        <w:t>……………………………………………………………………………….……………………………………………………………</w:t>
-      </w:r>
-      <w:bookmarkStart w:id="0" w:name="_GoBack"/>
-      <w:bookmarkEnd w:id="0"/>
+        </w:rPr>
+      </w:pPr>
     </w:p>
     <w:p>
       <w:pPr>
-        <w:rPr>
-          <w:sz w:val="24"/>
-          <w:szCs w:val="24"/>
-        </w:rPr>
-      </w:pPr>
-    </w:p>
-    <w:p>
-      <w:pPr>
-        <w:rPr>
-          <w:sz w:val="24"/>
-          <w:szCs w:val="24"/>
-        </w:rPr>
-      </w:pPr>
-    </w:p>
-    <w:p>
-      <w:pPr>
         <w:spacing w:after="60"/>
         <w:jc w:val="right"/>
       </w:pPr>
@@ -2601,6 +3595,7 @@
         <w:rPr>
           <w:sz w:val="24"/>
         </w:rPr>
+        <w:lastRenderedPageBreak/>
         <w:t>Mẫu số 1.1. Nội dung ghi nhật ký công tác triển khai</w:t>
       </w:r>
     </w:p>
@@ -2639,7 +3634,7 @@
           <w:sz w:val="24"/>
           <w:szCs w:val="24"/>
         </w:rPr>
-        <w:t>Giai đoạn 5 – Phối hợp kiểm thử hệ thống và hoàn thiện phần mềm</w:t>
+        <w:t>Giai đoạn 6 – Đào tạo, chuyển giao và triển khai chính thức</w:t>
       </w:r>
     </w:p>
     <w:p>
@@ -2648,25 +3643,32 @@
         <w:jc w:val="center"/>
         <w:rPr>
           <w:b/>
+          <w:sz w:val="28"/>
+          <w:szCs w:val="28"/>
+        </w:rPr>
+      </w:pPr>
+    </w:p>
+    <w:p>
+      <w:pPr>
+        <w:spacing w:after="60"/>
+        <w:rPr>
           <w:sz w:val="24"/>
           <w:szCs w:val="24"/>
         </w:rPr>
       </w:pPr>
-    </w:p>
-    <w:p>
-      <w:pPr>
-        <w:spacing w:after="60"/>
+      <w:r>
         <w:rPr>
           <w:sz w:val="24"/>
           <w:szCs w:val="24"/>
         </w:rPr>
-      </w:pPr>
+        <w:t>Công việc: Cài đặt, cập nhật, hiệu chỉnh cơ sở dữ liệu, phần</w:t>
+      </w:r>
       <w:r>
         <w:rPr>
           <w:sz w:val="24"/>
           <w:szCs w:val="24"/>
         </w:rPr>
-        <w:t>Công việc: Cài đặt, cập nhật, hiệu chỉnh cơ sở dữ liệu, phần mềm Hệ thống số liệu điều hành bay</w:t>
+        <w:t xml:space="preserve"> mềm Hệ thống số liệu điều hành bay</w:t>
       </w:r>
     </w:p>
     <w:p>
@@ -2822,14 +3824,14 @@
                 <w:b/>
                 <w:sz w:val="22"/>
               </w:rPr>
-              <w:t>Ý kiến và chữ ký xác nhận của đại diện đơn vị giám sát công tác triển khai (nếu có) đ</w:t>
+              <w:t>Ý kiến và chữ ký xác nhận của đại diện đơn vị giám sát công tác triển khai (nếu có) đố</w:t>
             </w:r>
             <w:r>
               <w:rPr>
                 <w:b/>
                 <w:sz w:val="22"/>
               </w:rPr>
-              <w:t>ối với các nội dung triển khai.</w:t>
+              <w:t>i với các nội dung triển khai.</w:t>
             </w:r>
           </w:p>
         </w:tc>
@@ -2854,7 +3856,7 @@
               <w:rPr>
                 <w:sz w:val="22"/>
               </w:rPr>
-              <w:t>5</w:t>
+              <w:t>6</w:t>
             </w:r>
           </w:p>
         </w:tc>
@@ -2874,21 +3876,26 @@
               <w:rPr>
                 <w:sz w:val="22"/>
               </w:rPr>
-              <w:t>Ngày 32 – 48</w:t>
+              <w:t>Ngày 45 – 56</w:t>
             </w:r>
             <w:r>
               <w:rPr>
                 <w:sz w:val="22"/>
               </w:rPr>
               <w:br/>
-              <w:t>Từ: 09/08/2026</w:t>
+            </w:r>
+            <w:r>
+              <w:rPr>
+                <w:sz w:val="22"/>
+              </w:rPr>
+              <w:t>Từ: 22/08/2026</w:t>
             </w:r>
             <w:r>
               <w:rPr>
                 <w:sz w:val="22"/>
               </w:rPr>
               <w:br/>
-              <w:t>Đến: 25/08/2026</w:t>
+              <w:t>Đến: 02/09/2026</w:t>
             </w:r>
           </w:p>
         </w:tc>
@@ -2907,7 +3914,7 @@
               <w:rPr>
                 <w:sz w:val="22"/>
               </w:rPr>
-              <w:t>Giai đoạn 5 – Phối hợp kiểm thử hệ thống và hoàn thiện phần mềm</w:t>
+              <w:t>Giai đoạn 6 – Đào tạo, chuyển giao và triển khai chính thức</w:t>
             </w:r>
             <w:r>
               <w:rPr>
@@ -2921,60 +3928,60 @@
                 <w:sz w:val="22"/>
               </w:rPr>
               <w:br/>
-              <w:t xml:space="preserve">- Đã phối hợp chuẩn bị môi trường, tài khoản, dữ liệu </w:t>
-            </w:r>
-            <w:r>
-              <w:rPr>
-                <w:sz w:val="22"/>
-              </w:rPr>
-              <w:t>và bộ kịch bản kiểm thử cho đầy đủ phạm vi 05 nhóm/53 chức năng.</w:t>
+              <w:t>- Đã lập kế hoạch và tổ chức đào tạo cho người sử dụng, cán bộ quản trị/vận hành và cán bộ hỗ trợ theo danh sách được phê duyệt.</w:t>
             </w:r>
             <w:r>
               <w:rPr>
                 <w:sz w:val="22"/>
               </w:rPr>
               <w:br/>
-              <w:t>- Đã thực hiện/ hỗ trợ kiểm thử chức năng, tích hợp, dữ liệu, phân quyền, báo cáo, cảnh báo, hiệu năng và các yêu cầu an toàn–lưu vết theo kế hoạch.</w:t>
+              <w:t>- Đã</w:t>
+            </w:r>
+            <w:r>
+              <w:rPr>
+                <w:sz w:val="22"/>
+              </w:rPr>
+              <w:t xml:space="preserve"> hướng dẫn quy trình nghiệp vụ, sử dụng 05 nhóm chức năng, xử lý cảnh báo/sự cố, khai thác báo cáo và quản trị hệ thống.</w:t>
             </w:r>
             <w:r>
               <w:rPr>
                 <w:sz w:val="22"/>
               </w:rPr>
               <w:br/>
-              <w:t xml:space="preserve">- Đã ghi nhận kết quả từng ca kiểm thử và </w:t>
-            </w:r>
-            <w:r>
-              <w:rPr>
-                <w:sz w:val="22"/>
-              </w:rPr>
-              <w:t>bằng chứng; phân loại lỗi theo mức độ, xác định nguyên nhân, trách nhiệm và thời hạn khắc phục.</w:t>
+              <w:t>- Đã chuẩn bị môi trường chính thức, sao lưu hiện trạng, lập phương án triển khai–rollback và kiểm tra điều kiện trước chuyển đổi.</w:t>
             </w:r>
             <w:r>
               <w:rPr>
                 <w:sz w:val="22"/>
               </w:rPr>
               <w:br/>
-              <w:t>- Đã sửa lỗi, cập nhật mã nguồn/script/cấu hình, phát hành build mới và phối hợp kiểm thử lại đến khi đóng lỗi hoặc thống nhất tồn tại.</w:t>
+              <w:t>- Đã</w:t>
+            </w:r>
+            <w:r>
+              <w:rPr>
+                <w:sz w:val="22"/>
+              </w:rPr>
+              <w:t xml:space="preserve"> cài đặt/cập nhật phiên bản chính thức, triển khai script dữ liệu/cấu hình, kiểm tra dịch vụ và thực hiện kiểm tra nhanh sau triển khai.</w:t>
             </w:r>
             <w:r>
               <w:rPr>
                 <w:sz w:val="22"/>
               </w:rPr>
               <w:br/>
-              <w:t>- Đã đối chiếu kết quả v</w:t>
-            </w:r>
-            <w:r>
-              <w:rPr>
-                <w:sz w:val="22"/>
-              </w:rPr>
-              <w:t>ới yêu cầu, thiết kế chi tiết và tiêu chí chấp nhận; cập nhật ma trận truy vết và hồ sơ thay đổi.</w:t>
+              <w:t>- Đã chuyển giao mã nguồn/gói cài đặt, tài liệu, dữ liệu, cấu hình, tài khoản theo phương thức an toàn và hướng dẫn sao</w:t>
+            </w:r>
+            <w:r>
+              <w:rPr>
+                <w:sz w:val="22"/>
+              </w:rPr>
+              <w:t xml:space="preserve"> lưu/khôi phục.</w:t>
             </w:r>
             <w:r>
               <w:rPr>
                 <w:sz w:val="22"/>
               </w:rPr>
               <w:br/>
-              <w:t>- Đã hoàn thiện phiên bản phát hành dự kiến, tài liệu người dùng/quản trị và danh mục vấn đề còn lại để trình xem xét.</w:t>
+              <w:t>- Đã theo dõi vận hành ban đầu, tiếp nhận phản hồi, xử lý vấn đề phát sinh và xác nhận trạng thái hệ thống sau triển khai.</w:t>
             </w:r>
             <w:r>
               <w:rPr>
@@ -2988,65 +3995,86 @@
                 <w:sz w:val="22"/>
               </w:rPr>
               <w:br/>
-              <w:t>- Báo c</w:t>
-            </w:r>
-            <w:r>
-              <w:rPr>
-                <w:sz w:val="22"/>
-              </w:rPr>
-              <w:t xml:space="preserve">áo kiểm thử hệ thống/UAT; số 01/2026/BCKTHT-HTQLSLB; </w:t>
-            </w:r>
-            <w:r>
-              <w:rPr>
-                <w:sz w:val="22"/>
-              </w:rPr>
-              <w:t>ngày 25/08/2026; phiên bản 1.0.</w:t>
+              <w:t>- Kế hoạch và chương trình đào tạo; mã HTQLSLB-KHDT-01; ngày 26/08/2026; phiên bản 1.</w:t>
+            </w:r>
+            <w:r>
+              <w:rPr>
+                <w:sz w:val="22"/>
+              </w:rPr>
+              <w:t>0.</w:t>
             </w:r>
             <w:r>
               <w:rPr>
                 <w:sz w:val="22"/>
               </w:rPr>
               <w:br/>
+              <w:t xml:space="preserve">- Biên bản đào tạo người sử dụng và quản trị; số 01/2026/BBDT-HTQLSLB; ngày 02/09/2026; phiên </w:t>
             </w:r>
             <w:r>
               <w:rPr>
                 <w:sz w:val="22"/>
               </w:rPr>
               <w:lastRenderedPageBreak/>
-              <w:t>- Biên bản xác nhận đủ điều kiện triển khai chính thức; số 01/2026/BBDK-HTQLSLB; ngày 25/08/2026; phiên bản 1.0.</w:t>
+              <w:t>bản hồ sơ 1.0.</w:t>
             </w:r>
             <w:r>
               <w:rPr>
                 <w:sz w:val="22"/>
               </w:rPr>
               <w:br/>
-              <w:t xml:space="preserve">Tình trạng hoàn thành: Hoàn thành 100% ngày 25/08/2026, đúng mốc Ngày 48; 53 chức năng đã được kiểm tra, các lỗi ảnh hưởng nghiệm thu </w:t>
-            </w:r>
-            <w:r>
-              <w:rPr>
-                <w:sz w:val="22"/>
-              </w:rPr>
-              <w:t>đã được khắc phục và xác nhận lại.</w:t>
+              <w:t xml:space="preserve">- Tài liệu hướng dẫn sử dụng; mã HTQLSLB-HDSD-01; ngày 02/09/2026; phiên </w:t>
+            </w:r>
+            <w:r>
+              <w:rPr>
+                <w:sz w:val="22"/>
+              </w:rPr>
+              <w:t>bản 1.0.</w:t>
             </w:r>
             <w:r>
               <w:rPr>
                 <w:sz w:val="22"/>
               </w:rPr>
               <w:br/>
-              <w:t>Sự cố, sai khác, phát sinh và biện pháp xử lý: Các lỗi và ý kiến UAT đã được quản lý trong HTQLSLB-DEFECT-UAT-01. Không còn lỗi nghiêm trọng hoặc lỗi cản trở triển khai chính thức tại thời điểm chốt báo cáo.</w:t>
+              <w:t>- Biên bản chuyển giao mã nguồn, gói cài đặt, dữ liệu, cấu hìn</w:t>
+            </w:r>
+            <w:r>
+              <w:rPr>
+                <w:sz w:val="22"/>
+              </w:rPr>
+              <w:t>h và tài liệu; số 01/2026/BBCG-HTQLSLB; ngày 02/09/2026; phiên bản hồ sơ 1.0.</w:t>
             </w:r>
             <w:r>
               <w:rPr>
                 <w:sz w:val="22"/>
               </w:rPr>
               <w:br/>
-              <w:t>Đề nghị, kiến</w:t>
-            </w:r>
-            <w:r>
-              <w:rPr>
-                <w:sz w:val="22"/>
-              </w:rPr>
-              <w:t xml:space="preserve"> nghị và ý kiến giải quyết: Thống nhất sử dụng phiên bản HTQLSLB-1.0.0-RC2 làm cơ sở đào tạo, chuyển giao và phát hành phiên bản chính thức.</w:t>
+              <w:t>Tình trạng hoàn thành: Hoàn thành 100% ngày 02/09/2026, đúng mốc Ngày 56; người sử dụng/quản trị đã được đào tạo, phiên bản HTQLSLB 1.0.0 đã triển khai và hồ sơ chuyển giao đã ho</w:t>
+            </w:r>
+            <w:r>
+              <w:rPr>
+                <w:sz w:val="22"/>
+              </w:rPr>
+              <w:t>àn tất.</w:t>
+            </w:r>
+            <w:r>
+              <w:rPr>
+                <w:sz w:val="22"/>
+              </w:rPr>
+              <w:br/>
+              <w:t>Sự cố, sai khác, phát sinh và biện pháp xử lý: Không có sự cố ảnh hưởng việc đưa hệ thống vào vận hành. Các phản hồi ban đầu sau triển khai đã được tiếp nhận, xử lý và cập nhật trong nhật ký hỗ trợ.</w:t>
+            </w:r>
+            <w:r>
+              <w:rPr>
+                <w:sz w:val="22"/>
+              </w:rPr>
+              <w:br/>
+              <w:t>Đề nghị, kiến nghị và ý kiến giải quyết: Đơn vị t</w:t>
+            </w:r>
+            <w:r>
+              <w:rPr>
+                <w:sz w:val="22"/>
+              </w:rPr>
+              <w:t>iếp nhận xác nhận đã nhận đủ tài liệu, sản phẩm và hướng dẫn vận hành; hệ thống đủ điều kiện lập hồ sơ nghiệm thu, bàn giao đưa vào sử dụng.</w:t>
             </w:r>
           </w:p>
         </w:tc>
@@ -3062,8 +4090,6 @@
                 <w:sz w:val="22"/>
               </w:rPr>
             </w:pPr>
-            <w:bookmarkStart w:id="0" w:name="_GoBack"/>
-            <w:bookmarkEnd w:id="0"/>
           </w:p>
         </w:tc>
       </w:tr>
@@ -3101,7 +4127,15 @@
           <w:sz w:val="24"/>
           <w:szCs w:val="24"/>
         </w:rPr>
-        <w:t>Hồ sơ kèm theo/đối chiếu: xem đầy đủ tên, mã/số, ngày và phiên bản tại mục Kết quả/sản phẩm đã hoàn thành trong bảng nhật ký.</w:t>
+        <w:t xml:space="preserve">Hồ sơ kèm theo/đối chiếu: xem đầy đủ tên, mã/số, ngày và phiên bản tại mục Kết </w:t>
+      </w:r>
+      <w:r>
+        <w:rPr>
+          <w:i/>
+          <w:sz w:val="24"/>
+          <w:szCs w:val="24"/>
+        </w:rPr>
+        <w:t>quả/sản phẩm đã hoàn thành trong bảng nhật ký.</w:t>
       </w:r>
     </w:p>
     <w:p>
@@ -3133,11 +4167,39 @@
       <w:pPr>
         <w:spacing w:after="60"/>
         <w:jc w:val="right"/>
+        <w:rPr>
+          <w:sz w:val="24"/>
+        </w:rPr>
+      </w:pPr>
+    </w:p>
+    <w:p>
+      <w:pPr>
+        <w:spacing w:after="60"/>
+        <w:jc w:val="right"/>
+        <w:rPr>
+          <w:sz w:val="24"/>
+        </w:rPr>
+      </w:pPr>
+    </w:p>
+    <w:p>
+      <w:pPr>
+        <w:spacing w:after="60"/>
+        <w:jc w:val="right"/>
+        <w:rPr>
+          <w:sz w:val="24"/>
+        </w:rPr>
+      </w:pPr>
+    </w:p>
+    <w:p>
+      <w:pPr>
+        <w:spacing w:after="60"/>
+        <w:jc w:val="right"/>
       </w:pPr>
       <w:r>
         <w:rPr>
           <w:sz w:val="24"/>
         </w:rPr>
+        <w:lastRenderedPageBreak/>
         <w:t>Mẫu số 1.1. Nội dung ghi nhật ký công tác triển khai</w:t>
       </w:r>
     </w:p>
@@ -3166,33 +4228,20 @@
         <w:jc w:val="center"/>
         <w:rPr>
           <w:b/>
-          <w:sz w:val="24"/>
-          <w:szCs w:val="24"/>
+          <w:sz w:val="22"/>
         </w:rPr>
       </w:pPr>
       <w:r>
         <w:rPr>
           <w:b/>
-          <w:sz w:val="24"/>
-          <w:szCs w:val="24"/>
-        </w:rPr>
-        <w:t>Giai đoạn 6 – Đào tạo, chuyển giao và triển khai chính thức</w:t>
+          <w:sz w:val="22"/>
+        </w:rPr>
+        <w:t>Giai đoạn 7 – Nghiệm thu và bàn giao</w:t>
       </w:r>
     </w:p>
     <w:p>
       <w:pPr>
         <w:spacing w:after="60"/>
-        <w:jc w:val="center"/>
-        <w:rPr>
-          <w:b/>
-          <w:sz w:val="28"/>
-          <w:szCs w:val="28"/>
-        </w:rPr>
-      </w:pPr>
-    </w:p>
-    <w:p>
-      <w:pPr>
-        <w:spacing w:after="60"/>
         <w:rPr>
           <w:sz w:val="24"/>
           <w:szCs w:val="24"/>
@@ -3203,7 +4252,14 @@
           <w:sz w:val="24"/>
           <w:szCs w:val="24"/>
         </w:rPr>
-        <w:t>Công việc: Cài đặt, cập nhật, hiệu chỉnh cơ sở dữ liệu, phần mềm Hệ thống số liệu điều hành bay</w:t>
+        <w:t xml:space="preserve">Công việc: Cài đặt, cập nhật, hiệu chỉnh cơ sở dữ liệu, phần </w:t>
+      </w:r>
+      <w:r>
+        <w:rPr>
+          <w:sz w:val="24"/>
+          <w:szCs w:val="24"/>
+        </w:rPr>
+        <w:t>mềm Hệ thống số liệu điều hành bay</w:t>
       </w:r>
     </w:p>
     <w:p>
@@ -3368,6 +4424,13 @@
               </w:rPr>
               <w:t>i với các nội dung triển khai.</w:t>
             </w:r>
+            <w:r>
+              <w:rPr>
+                <w:b/>
+                <w:sz w:val="22"/>
+              </w:rPr>
+              <w:br/>
+            </w:r>
           </w:p>
         </w:tc>
       </w:tr>
@@ -3391,7 +4454,7 @@
               <w:rPr>
                 <w:sz w:val="22"/>
               </w:rPr>
-              <w:t>6</w:t>
+              <w:t>7</w:t>
             </w:r>
           </w:p>
         </w:tc>
@@ -3411,21 +4474,21 @@
               <w:rPr>
                 <w:sz w:val="22"/>
               </w:rPr>
-              <w:t>Ngày 45 – 56</w:t>
+              <w:t>Ngày 56 – 60</w:t>
             </w:r>
             <w:r>
               <w:rPr>
                 <w:sz w:val="22"/>
               </w:rPr>
               <w:br/>
-              <w:t>Từ: 22/08/2026</w:t>
+              <w:t>Từ: 02/09/2026</w:t>
             </w:r>
             <w:r>
               <w:rPr>
                 <w:sz w:val="22"/>
               </w:rPr>
               <w:br/>
-              <w:t>Đến: 02/09/2026</w:t>
+              <w:t>Đến: 06/09/2026</w:t>
             </w:r>
           </w:p>
         </w:tc>
@@ -3444,7 +4507,7 @@
               <w:rPr>
                 <w:sz w:val="22"/>
               </w:rPr>
-              <w:t>Giai đoạn 6 – Đào tạo, chuyển giao và triển khai chính thức</w:t>
+              <w:t>Giai đoạn 7 – Nghiệm thu và bàn giao</w:t>
             </w:r>
             <w:r>
               <w:rPr>
@@ -3458,60 +4521,65 @@
                 <w:sz w:val="22"/>
               </w:rPr>
               <w:br/>
-              <w:t>- Đã lập kế hoạch và tổ chức đào tạo cho người sử dụng, cán bộ</w:t>
-            </w:r>
-            <w:r>
-              <w:rPr>
-                <w:sz w:val="22"/>
-              </w:rPr>
-              <w:t xml:space="preserve"> quản trị/vận hành và cán bộ hỗ trợ theo danh sách được phê duyệt.</w:t>
+            </w:r>
+            <w:r>
+              <w:rPr>
+                <w:sz w:val="22"/>
+              </w:rPr>
+              <w:t>- Đã rà soát khối lượng, chất lượng, tiến độ và hồ sơ của 05 nhóm/53 chức năng; đối chiếu hợp đồng, thiết kế chi tiết và các thay đổi được phê duyệt.</w:t>
             </w:r>
             <w:r>
               <w:rPr>
                 <w:sz w:val="22"/>
               </w:rPr>
               <w:br/>
-              <w:t>- Đã hướng dẫn quy trình nghiệp vụ, sử dụng 05 nhóm chức năng, xử lý cảnh báo/sự cố, khai thác báo cáo và quản trị hệ thống.</w:t>
+              <w:t>- Đã kiểm tra tính đầy đủ của biên bản kỹ thuật, báo cáo kiểm thử/vận hành thử, hồ sơ cài đặt, tài liệu đà</w:t>
+            </w:r>
+            <w:r>
+              <w:rPr>
+                <w:sz w:val="22"/>
+              </w:rPr>
+              <w:t>o tạo/chuyển giao và bằng chứng từng chức năng.</w:t>
             </w:r>
             <w:r>
               <w:rPr>
                 <w:sz w:val="22"/>
               </w:rPr>
               <w:br/>
-              <w:t>- Đã chuẩn bị môi trường chính thức, sao lưu hiện trạng, lập phư</w:t>
-            </w:r>
-            <w:r>
-              <w:rPr>
-                <w:sz w:val="22"/>
-              </w:rPr>
-              <w:t>ơng án triển khai–rollback và kiểm tra điều kiện trước chuyển đổi.</w:t>
+              <w:t>- Đã tổng hợp, xử lý hoặc phân loại tồn tại; xác định nội dung đủ điều kiện nghiệm thu, nội dung nghiệm thu có điều kiện và nội dung chưa được chấp nhận.</w:t>
             </w:r>
             <w:r>
               <w:rPr>
                 <w:sz w:val="22"/>
               </w:rPr>
               <w:br/>
-              <w:t>- Đã cài đặt/cập nhật phiên bản chính thức, triển khai script dữ liệu/cấu hình, kiểm tra dịch vụ và thực hiện kiểm tra nhanh sau triển khai.</w:t>
+              <w:t>- Đã tổ chức nghiệm thu kỹ thuật đối với các sản phẩm/</w:t>
+            </w:r>
+            <w:r>
+              <w:rPr>
+                <w:sz w:val="22"/>
+              </w:rPr>
+              <w:t>thành phần và nghiệm thu sản phẩm hoặc hạng mục công việc của dự án.</w:t>
             </w:r>
             <w:r>
               <w:rPr>
                 <w:sz w:val="22"/>
               </w:rPr>
               <w:br/>
-              <w:t>- Đã chuyển giao mã nguồn/gói cài đặt, tài liệu,</w:t>
-            </w:r>
-            <w:r>
-              <w:rPr>
-                <w:sz w:val="22"/>
-              </w:rPr>
-              <w:t xml:space="preserve"> dữ liệu, cấu hình, tài khoản theo phương thức an toàn và hướng dẫn sao lưu/khôi phục.</w:t>
+              <w:t>- Đã bàn giao phiên bản phần mềm, cơ sở dữ liệu, mã nguồn/gói triển khai, tài liệu, dữ liệu và quyền quản trị cho đơn vị tiếp nhận.</w:t>
             </w:r>
             <w:r>
               <w:rPr>
                 <w:sz w:val="22"/>
               </w:rPr>
               <w:br/>
-              <w:t>- Đã theo dõi vận hành ban đầu, tiếp nhận phản hồi, xử lý vấn đề phát sinh và xác nhận trạng thái hệ thống sau triển khai.</w:t>
+              <w:t xml:space="preserve">- Đã thống nhất trách nhiệm bảo hành, hỗ trợ, bảo mật, </w:t>
+            </w:r>
+            <w:r>
+              <w:rPr>
+                <w:sz w:val="22"/>
+              </w:rPr>
+              <w:t>quản lý thay đổi và lưu trữ hồ sơ hoàn thành sau nghiệm thu.</w:t>
             </w:r>
             <w:r>
               <w:rPr>
@@ -3525,86 +4593,85 @@
                 <w:sz w:val="22"/>
               </w:rPr>
               <w:br/>
-              <w:t xml:space="preserve">- Kế hoạch và </w:t>
-            </w:r>
-            <w:r>
-              <w:rPr>
-                <w:sz w:val="22"/>
-              </w:rPr>
-              <w:t>chương trình đào tạo; mã HTQLSLB-KHDT-01; ngày 26/08/2026; phiên bản 1.0.</w:t>
+              <w:t>- Bộ Biên bản nghiệm thu kỹ thuật theo Mẫu số 5; số 01-02/2026/BBNTKT-HTQLSLB; ngày hoàn tất 06/09/2026; phiên bản hồ sơ 1.0.</w:t>
             </w:r>
             <w:r>
               <w:rPr>
                 <w:sz w:val="22"/>
               </w:rPr>
               <w:br/>
-              <w:t xml:space="preserve">- Biên bản đào tạo người sử dụng và quản trị; số </w:t>
+              <w:t>- Biên bản nghiệm thu sản phẩm/hạng m</w:t>
+            </w:r>
+            <w:r>
+              <w:rPr>
+                <w:sz w:val="22"/>
+              </w:rPr>
+              <w:t>ục theo Mẫu số 6; số 01/2026/BBNTSP-HTQLSLB; ngày 06/09/2026; phiên bản hồ sơ 1.0.</w:t>
+            </w:r>
+            <w:r>
+              <w:rPr>
+                <w:sz w:val="22"/>
+              </w:rPr>
+              <w:br/>
             </w:r>
             <w:r>
               <w:rPr>
                 <w:sz w:val="22"/>
               </w:rPr>
               <w:lastRenderedPageBreak/>
-              <w:t>01/2026/BBDT-HTQLSLB; ngày 02/09/2026; phiên bản hồ sơ 1.0.</w:t>
+              <w:t xml:space="preserve">- Phụ lục kết quả nghiệm thu chi tiết 05 nhóm/53 chức năng; mã HTQLSLB-PLNT-01; </w:t>
+            </w:r>
+            <w:r>
+              <w:rPr>
+                <w:sz w:val="22"/>
+              </w:rPr>
+              <w:t>ngày 06/09/2026; phiên bản 1.0.</w:t>
             </w:r>
             <w:r>
               <w:rPr>
                 <w:sz w:val="22"/>
               </w:rPr>
               <w:br/>
-              <w:t xml:space="preserve">- Tài liệu hướng dẫn sử dụng; mã HTQLSLB-HDSD-01; ngày 02/09/2026; phiên </w:t>
-            </w:r>
-            <w:r>
-              <w:rPr>
-                <w:sz w:val="22"/>
-              </w:rPr>
-              <w:t>bản 1.0.</w:t>
+              <w:t xml:space="preserve">- Cam kết bảo hành, hỗ trợ và danh sách đầu mối vận hành; số </w:t>
+            </w:r>
+            <w:r>
+              <w:rPr>
+                <w:sz w:val="22"/>
+              </w:rPr>
+              <w:t>01/2026/BHHT-HTQLSLB; ngày 06/09/2026; thời hạn theo hợp đồng.</w:t>
             </w:r>
             <w:r>
               <w:rPr>
                 <w:sz w:val="22"/>
               </w:rPr>
               <w:br/>
-              <w:t>- Biên bản chuyển giao mã nguồ</w:t>
-            </w:r>
-            <w:r>
-              <w:rPr>
-                <w:sz w:val="22"/>
-              </w:rPr>
-              <w:t>n, gói cài đặt, dữ liệu, cấu hình và tài liệu; số 01/2026/BBCG-HTQLSLB; ngày 02/09/2026; phiên bản hồ sơ 1.0.</w:t>
+              <w:t>Tình trạng hoàn thành: Hoàn thành 100% ngày 06/09/2026, đúng mốc Ngày 60; đủ khối lượng 05 nhóm/53 chức năng, hồ sơ nghiệm thu và sản phẩm bàn giao phiên bản HTQLSLB 1.0.0.</w:t>
             </w:r>
             <w:r>
               <w:rPr>
                 <w:sz w:val="22"/>
               </w:rPr>
               <w:br/>
-              <w:t>Tình trạng hoàn thành: Hoàn thành 100% ngày 02/09/2026, đúng mốc Ngày 56; người sử dụng/quản trị đã được đào tạo, phiên bản HTQLSLB 1.0.0 đã triển</w:t>
-            </w:r>
-            <w:r>
-              <w:rPr>
-                <w:sz w:val="22"/>
-              </w:rPr>
-              <w:t xml:space="preserve"> khai và hồ sơ chuyển giao đã hoàn tất.</w:t>
+              <w:t>Sự cố, sai khác, phá</w:t>
+            </w:r>
+            <w:r>
+              <w:rPr>
+                <w:sz w:val="22"/>
+              </w:rPr>
+              <w:t>t sinh và biện pháp xử lý: Không còn tồn tại ảnh hưởng việc nghiệm thu và đưa hệ thống vào sử dụng. Các yêu cầu hỗ trợ sau bàn giao được quản lý theo cam kết bảo hành/hỗ trợ và quy trình vận hành.</w:t>
             </w:r>
             <w:r>
               <w:rPr>
                 <w:sz w:val="22"/>
               </w:rPr>
               <w:br/>
-              <w:t>Sự cố, sai khác, phát sinh và biện pháp xử lý: Không có sự cố ảnh hưởng việc đưa hệ thống vào vận hành. Các phản hồi ban đầu sau triển khai đã được tiếp nhận, xử lý và cập nhật trong nhật ký hỗ trợ.</w:t>
-            </w:r>
-            <w:r>
-              <w:rPr>
-                <w:sz w:val="22"/>
-              </w:rPr>
-              <w:br/>
-              <w:t>Đề nghị, kiến ngh</w:t>
-            </w:r>
-            <w:r>
-              <w:rPr>
-                <w:sz w:val="22"/>
-              </w:rPr>
-              <w:t>ị và ý kiến giải quyết: Đơn vị tiếp nhận xác nhận đã nhận đủ tài liệu, sản phẩm và hướng dẫn vận hành; hệ thống đủ điều kiện lập hồ sơ nghiệm thu, bàn giao đưa vào sử dụng.</w:t>
+              <w:t>Đề nghị, kiến nghị và ý kiến giải quyết: Các bên thống nhất</w:t>
+            </w:r>
+            <w:r>
+              <w:rPr>
+                <w:sz w:val="22"/>
+              </w:rPr>
+              <w:t xml:space="preserve"> chấp nhận nghiệm thu, bàn giao sản phẩm để đưa vào sử dụng và thực hiện bảo hành/hỗ trợ theo hợp đồng.</w:t>
             </w:r>
           </w:p>
         </w:tc>
@@ -3620,6 +4687,8 @@
                 <w:sz w:val="22"/>
               </w:rPr>
             </w:pPr>
+            <w:bookmarkStart w:id="0" w:name="_GoBack"/>
+            <w:bookmarkEnd w:id="0"/>
           </w:p>
         </w:tc>
       </w:tr>
@@ -3634,7 +4703,6 @@
           <w:szCs w:val="24"/>
         </w:rPr>
       </w:pPr>
-      <w:bookmarkStart w:id="0" w:name="_GoBack"/>
       <w:r>
         <w:rPr>
           <w:rFonts w:ascii="Times New Roman" w:eastAsia="Times New Roman" w:hAnsi="Times New Roman"/>
@@ -3658,10 +4726,17 @@
           <w:sz w:val="24"/>
           <w:szCs w:val="24"/>
         </w:rPr>
-        <w:t>Hồ sơ kèm theo/đối chiếu: xem đầy đủ tên, mã/số, ngày và phiên bản tại mục Kết quả/sản phẩm đã hoàn thành trong bảng nhật ký.</w:t>
+        <w:t>Hồ sơ kèm theo/đối chiếu: x</w:t>
+      </w:r>
+      <w:r>
+        <w:rPr>
+          <w:i/>
+          <w:sz w:val="24"/>
+          <w:szCs w:val="24"/>
+        </w:rPr>
+        <w:t>em đầy đủ tên, mã/số, ngày và phiên bản tại mục Kết quả/sản phẩm đã hoàn thành trong bảng nhật ký.</w:t>
       </w:r>
     </w:p>
-    <w:bookmarkEnd w:id="0"/>
     <w:p>
       <w:r>
         <w:t>……………………………………………………………………………….…………………………………………………………………………………………</w:t>
@@ -3686,580 +4761,13 @@
       </w:r>
     </w:p>
     <w:p/>
-    <w:p/>
-    <w:p>
-      <w:pPr>
-        <w:spacing w:after="60"/>
-        <w:jc w:val="right"/>
-      </w:pPr>
-      <w:r>
-        <w:rPr>
-          <w:sz w:val="24"/>
-        </w:rPr>
-        <w:t>Mẫu số 1.1. Nội dung ghi nhật ký công tác triển khai</w:t>
-      </w:r>
-    </w:p>
-    <w:p>
-      <w:pPr>
-        <w:spacing w:after="60"/>
-        <w:jc w:val="center"/>
-        <w:rPr>
-          <w:b/>
-          <w:sz w:val="32"/>
-          <w:szCs w:val="32"/>
-        </w:rPr>
-      </w:pPr>
-      <w:r>
-        <w:rPr>
-          <w:b/>
-          <w:sz w:val="32"/>
-          <w:szCs w:val="32"/>
-        </w:rPr>
-        <w:t>NỘI DUNG NHẬT KÝ CÔNG TÁC TRIỂN KHAI</w:t>
-      </w:r>
-    </w:p>
-    <w:p>
-      <w:pPr>
-        <w:spacing w:after="60"/>
-        <w:jc w:val="center"/>
-        <w:rPr>
-          <w:b/>
-          <w:sz w:val="22"/>
-        </w:rPr>
-      </w:pPr>
-      <w:r>
-        <w:rPr>
-          <w:b/>
-          <w:sz w:val="22"/>
-        </w:rPr>
-        <w:t>Giai đoạn 7 – Nghiệm thu và bàn giao</w:t>
-      </w:r>
-    </w:p>
-    <w:p>
-      <w:pPr>
-        <w:spacing w:after="60"/>
-        <w:rPr>
-          <w:sz w:val="24"/>
-          <w:szCs w:val="24"/>
-        </w:rPr>
-      </w:pPr>
-      <w:r>
-        <w:rPr>
-          <w:sz w:val="24"/>
-          <w:szCs w:val="24"/>
-        </w:rPr>
-        <w:t>Công việc: Cài đặt, cập nhật, hiệu chỉnh cơ sở dữ liệu, phần mềm Hệ thống số liệu điều hành bay</w:t>
-      </w:r>
-    </w:p>
-    <w:p>
-      <w:pPr>
-        <w:pStyle w:val="Heading1"/>
-        <w:spacing w:before="0" w:after="60"/>
-        <w:rPr>
-          <w:color w:val="auto"/>
-          <w:szCs w:val="24"/>
-        </w:rPr>
-      </w:pPr>
-      <w:r>
-        <w:rPr>
-          <w:rFonts w:ascii="Times New Roman" w:eastAsia="Times New Roman" w:hAnsi="Times New Roman"/>
-          <w:b w:val="0"/>
-          <w:color w:val="auto"/>
-          <w:szCs w:val="24"/>
-        </w:rPr>
-        <w:t>I. Nội dung công tác triển khai</w:t>
-      </w:r>
-    </w:p>
-    <w:tbl>
-      <w:tblPr>
-        <w:tblW w:w="14200" w:type="dxa"/>
-        <w:jc w:val="center"/>
-        <w:tblBorders>
-          <w:top w:val="single" w:sz="8" w:space="0" w:color="808080"/>
-          <w:left w:val="single" w:sz="8" w:space="0" w:color="808080"/>
-          <w:bottom w:val="single" w:sz="8" w:space="0" w:color="808080"/>
-          <w:right w:val="single" w:sz="8" w:space="0" w:color="808080"/>
-          <w:insideH w:val="single" w:sz="8" w:space="0" w:color="808080"/>
-          <w:insideV w:val="single" w:sz="8" w:space="0" w:color="808080"/>
-        </w:tblBorders>
-        <w:tblLayout w:type="fixed"/>
-        <w:tblLook w:val="04A0" w:firstRow="1" w:lastRow="0" w:firstColumn="1" w:lastColumn="0" w:noHBand="0" w:noVBand="1"/>
-      </w:tblPr>
-      <w:tblGrid>
-        <w:gridCol w:w="700"/>
-        <w:gridCol w:w="1900"/>
-        <w:gridCol w:w="5200"/>
-        <w:gridCol w:w="6400"/>
-      </w:tblGrid>
-      <w:tr>
-        <w:trPr>
-          <w:tblHeader/>
-          <w:jc w:val="center"/>
-        </w:trPr>
-        <w:tc>
-          <w:tcPr>
-            <w:tcW w:w="700" w:type="dxa"/>
-            <w:shd w:val="clear" w:color="auto" w:fill="D9EAF7"/>
-            <w:tcMar>
-              <w:top w:w="100" w:type="dxa"/>
-              <w:left w:w="100" w:type="dxa"/>
-              <w:bottom w:w="100" w:type="dxa"/>
-              <w:right w:w="100" w:type="dxa"/>
-            </w:tcMar>
-          </w:tcPr>
-          <w:p>
-            <w:pPr>
-              <w:spacing w:after="0" w:line="240" w:lineRule="auto"/>
-              <w:jc w:val="center"/>
-              <w:rPr>
-                <w:sz w:val="22"/>
-              </w:rPr>
-            </w:pPr>
-            <w:r>
-              <w:rPr>
-                <w:b/>
-                <w:sz w:val="22"/>
-              </w:rPr>
-              <w:t>STT</w:t>
-            </w:r>
-          </w:p>
-        </w:tc>
-        <w:tc>
-          <w:tcPr>
-            <w:tcW w:w="1900" w:type="dxa"/>
-            <w:shd w:val="clear" w:color="auto" w:fill="D9EAF7"/>
-            <w:tcMar>
-              <w:top w:w="100" w:type="dxa"/>
-              <w:left w:w="100" w:type="dxa"/>
-              <w:bottom w:w="100" w:type="dxa"/>
-              <w:right w:w="100" w:type="dxa"/>
-            </w:tcMar>
-          </w:tcPr>
-          <w:p>
-            <w:pPr>
-              <w:spacing w:after="0" w:line="240" w:lineRule="auto"/>
-              <w:jc w:val="center"/>
-              <w:rPr>
-                <w:sz w:val="22"/>
-              </w:rPr>
-            </w:pPr>
-            <w:r>
-              <w:rPr>
-                <w:b/>
-                <w:sz w:val="22"/>
-              </w:rPr>
-              <w:t>Thời gian triển khai</w:t>
-            </w:r>
-          </w:p>
-        </w:tc>
-        <w:tc>
-          <w:tcPr>
-            <w:tcW w:w="5200" w:type="dxa"/>
-            <w:shd w:val="clear" w:color="auto" w:fill="D9EAF7"/>
-            <w:tcMar>
-              <w:top w:w="100" w:type="dxa"/>
-              <w:left w:w="100" w:type="dxa"/>
-              <w:bottom w:w="100" w:type="dxa"/>
-              <w:right w:w="100" w:type="dxa"/>
-            </w:tcMar>
-          </w:tcPr>
-          <w:p>
-            <w:pPr>
-              <w:spacing w:after="0" w:line="240" w:lineRule="auto"/>
-              <w:jc w:val="center"/>
-              <w:rPr>
-                <w:sz w:val="22"/>
-              </w:rPr>
-            </w:pPr>
-            <w:r>
-              <w:rPr>
-                <w:b/>
-                <w:sz w:val="22"/>
-              </w:rPr>
-              <w:t>Nội dung công tác triển khai</w:t>
-            </w:r>
-          </w:p>
-        </w:tc>
-        <w:tc>
-          <w:tcPr>
-            <w:tcW w:w="6400" w:type="dxa"/>
-            <w:shd w:val="clear" w:color="auto" w:fill="D9EAF7"/>
-            <w:tcMar>
-              <w:top w:w="100" w:type="dxa"/>
-              <w:left w:w="100" w:type="dxa"/>
-              <w:bottom w:w="100" w:type="dxa"/>
-              <w:right w:w="100" w:type="dxa"/>
-            </w:tcMar>
-          </w:tcPr>
-          <w:p>
-            <w:pPr>
-              <w:spacing w:after="0" w:line="240" w:lineRule="auto"/>
-              <w:jc w:val="center"/>
-              <w:rPr>
-                <w:sz w:val="22"/>
-              </w:rPr>
-            </w:pPr>
-            <w:r>
-              <w:rPr>
-                <w:b/>
-                <w:sz w:val="22"/>
-              </w:rPr>
-              <w:t>Ý kiến và chữ ký xác nhận của đại diện đơn vị giám sát công tác triển khai (nếu có) đối với các nội dung triển khai.</w:t>
-            </w:r>
-            <w:r>
-              <w:rPr>
-                <w:b/>
-                <w:sz w:val="22"/>
-              </w:rPr>
-              <w:br/>
-            </w:r>
-            <w:r>
-              <w:rPr>
-                <w:b/>
-                <w:sz w:val="22"/>
-              </w:rPr>
-              <w:br/>
-              <w:t>Ý kiến và chữ ký xác nhận của đại diện tổ chức, cá nhân giám sát tác giả (đối với các nội dung giám sát tác giả).</w:t>
-            </w:r>
-          </w:p>
-        </w:tc>
-      </w:tr>
-      <w:tr>
-        <w:trPr>
-          <w:jc w:val="center"/>
-        </w:trPr>
-        <w:tc>
-          <w:tcPr>
-            <w:tcW w:w="700" w:type="dxa"/>
-            <w:vAlign w:val="center"/>
-          </w:tcPr>
-          <w:p>
-            <w:pPr>
-              <w:spacing w:after="0" w:line="240" w:lineRule="auto"/>
-              <w:rPr>
-                <w:sz w:val="22"/>
-              </w:rPr>
-            </w:pPr>
-            <w:r>
-              <w:rPr>
-                <w:sz w:val="22"/>
-              </w:rPr>
-              <w:t>7</w:t>
-            </w:r>
-          </w:p>
-        </w:tc>
-        <w:tc>
-          <w:tcPr>
-            <w:tcW w:w="1900" w:type="dxa"/>
-            <w:vAlign w:val="center"/>
-          </w:tcPr>
-          <w:p>
-            <w:pPr>
-              <w:spacing w:after="0" w:line="240" w:lineRule="auto"/>
-              <w:rPr>
-                <w:sz w:val="22"/>
-              </w:rPr>
-            </w:pPr>
-            <w:r>
-              <w:rPr>
-                <w:sz w:val="22"/>
-              </w:rPr>
-              <w:t>Ngày 56 – 60</w:t>
-            </w:r>
-            <w:r>
-              <w:rPr>
-                <w:sz w:val="22"/>
-              </w:rPr>
-              <w:br/>
-              <w:t>Từ: 02/09/2026</w:t>
-            </w:r>
-            <w:r>
-              <w:rPr>
-                <w:sz w:val="22"/>
-              </w:rPr>
-              <w:br/>
-              <w:t>Đến: 06/09/2026</w:t>
-            </w:r>
-          </w:p>
-        </w:tc>
-        <w:tc>
-          <w:tcPr>
-            <w:tcW w:w="5200" w:type="dxa"/>
-          </w:tcPr>
-          <w:p>
-            <w:pPr>
-              <w:spacing w:after="0" w:line="240" w:lineRule="auto"/>
-              <w:rPr>
-                <w:sz w:val="22"/>
-              </w:rPr>
-            </w:pPr>
-            <w:r>
-              <w:rPr>
-                <w:sz w:val="22"/>
-              </w:rPr>
-              <w:t>Giai đoạn 7 – Nghiệm thu và bàn giao</w:t>
-            </w:r>
-            <w:r>
-              <w:rPr>
-                <w:sz w:val="22"/>
-              </w:rPr>
-              <w:br/>
-              <w:t>Công việc thực tế đã thực hiện:</w:t>
-            </w:r>
-            <w:r>
-              <w:rPr>
-                <w:sz w:val="22"/>
-              </w:rPr>
-              <w:br/>
-              <w:t xml:space="preserve">- Đã rà soát khối lượng, chất lượng, tiến độ và hồ sơ của 05 nhóm/53 chức năng; đối chiếu hợp đồng, thiết kế </w:t>
-            </w:r>
-            <w:r>
-              <w:rPr>
-                <w:sz w:val="22"/>
-              </w:rPr>
-              <w:t>chi tiết và các thay đổi được phê duyệt.</w:t>
-            </w:r>
-            <w:r>
-              <w:rPr>
-                <w:sz w:val="22"/>
-              </w:rPr>
-              <w:br/>
-              <w:t>- Đã kiểm tra tính đầy đủ của biên bản kỹ thuật, báo cáo kiểm thử/vận hành thử, hồ sơ cài đặt, tài liệu đào tạo/chuyển giao và bằng chứng từng chức năng.</w:t>
-            </w:r>
-            <w:r>
-              <w:rPr>
-                <w:sz w:val="22"/>
-              </w:rPr>
-              <w:br/>
-              <w:t>- Đã tổng hợp, xử lý hoặc phân loại tồn tại; xác định nội dun</w:t>
-            </w:r>
-            <w:r>
-              <w:rPr>
-                <w:sz w:val="22"/>
-              </w:rPr>
-              <w:t>g đủ điều kiện nghiệm thu, nội dung nghiệm thu có điều kiện và nội dung chưa được chấp nhận.</w:t>
-            </w:r>
-            <w:r>
-              <w:rPr>
-                <w:sz w:val="22"/>
-              </w:rPr>
-              <w:br/>
-              <w:t>- Đã tổ chức nghiệm thu kỹ thuật đối với các sản phẩm/thành phần và nghiệm thu sản phẩm hoặc hạng mục công việc của dự án.</w:t>
-            </w:r>
-            <w:r>
-              <w:rPr>
-                <w:sz w:val="22"/>
-              </w:rPr>
-              <w:br/>
-              <w:t xml:space="preserve">- Đã bàn giao phiên bản phần mềm, cơ sở </w:t>
-            </w:r>
-            <w:r>
-              <w:rPr>
-                <w:sz w:val="22"/>
-              </w:rPr>
-              <w:t>dữ liệu, mã nguồn/gói triển khai, tài liệu, dữ liệu và quyền quản trị cho đơn vị tiếp nhận.</w:t>
-            </w:r>
-            <w:r>
-              <w:rPr>
-                <w:sz w:val="22"/>
-              </w:rPr>
-              <w:br/>
-              <w:t>- Đã thống nhất trách nhiệm bảo hành, hỗ trợ, bảo mật, quản lý thay đổi và lưu trữ hồ sơ hoàn thành sau nghiệm thu.</w:t>
-            </w:r>
-            <w:r>
-              <w:rPr>
-                <w:sz w:val="22"/>
-              </w:rPr>
-              <w:br/>
-              <w:t>Kết quả/sản phẩm đã hoàn thành:</w:t>
-            </w:r>
-            <w:r>
-              <w:rPr>
-                <w:sz w:val="22"/>
-              </w:rPr>
-              <w:br/>
-              <w:t>- Bộ Biên bản ng</w:t>
-            </w:r>
-            <w:r>
-              <w:rPr>
-                <w:sz w:val="22"/>
-              </w:rPr>
-              <w:t xml:space="preserve">hiệm thu kỹ thuật theo Mẫu số 5; số 01-02/2026/BBNTKT-HTQLSLB; ngày hoàn tất </w:t>
-            </w:r>
-            <w:r>
-              <w:rPr>
-                <w:sz w:val="22"/>
-              </w:rPr>
-              <w:lastRenderedPageBreak/>
-              <w:t>06/09/2026; phiên bản hồ sơ 1.0.</w:t>
-            </w:r>
-            <w:r>
-              <w:rPr>
-                <w:sz w:val="22"/>
-              </w:rPr>
-              <w:br/>
-              <w:t>- Biên bản nghiệm thu sản phẩm/hạng mục theo Mẫu số 6; số 01/2026/BBNTSP-HTQLSLB; ngày 06/09/2026; phiên bản hồ sơ 1.0.</w:t>
-            </w:r>
-            <w:r>
-              <w:rPr>
-                <w:sz w:val="22"/>
-              </w:rPr>
-              <w:br/>
-              <w:t>- Phụ lục kết quả nghiệm t</w:t>
-            </w:r>
-            <w:r>
-              <w:rPr>
-                <w:sz w:val="22"/>
-              </w:rPr>
-              <w:t xml:space="preserve">hu chi tiết 05 nhóm/53 chức năng; mã HTQLSLB-PLNT-01; </w:t>
-            </w:r>
-            <w:r>
-              <w:rPr>
-                <w:sz w:val="22"/>
-              </w:rPr>
-              <w:t>ngày 06/09/2026; phiên bản 1.0.</w:t>
-            </w:r>
-            <w:r>
-              <w:rPr>
-                <w:sz w:val="22"/>
-              </w:rPr>
-              <w:br/>
-              <w:t>- Cam kết bảo hành, hỗ trợ và danh sách đầu mối vận hành; số 01/2026/BHHT-HTQLSLB; ngày 06/09/2026; thời hạn theo hợp đồng.</w:t>
-            </w:r>
-            <w:r>
-              <w:rPr>
-                <w:sz w:val="22"/>
-              </w:rPr>
-              <w:br/>
-              <w:t>Tình trạng hoàn thành: Hoàn thành 100% ngày 06/09/2026, đúng mốc Ngày 60; đủ k</w:t>
-            </w:r>
-            <w:r>
-              <w:rPr>
-                <w:sz w:val="22"/>
-              </w:rPr>
-              <w:t>hối lượng 05 nhóm/53 chức năng, hồ sơ nghiệm thu và sản phẩm bàn giao phiên bản HTQLSLB 1.0.0.</w:t>
-            </w:r>
-            <w:r>
-              <w:rPr>
-                <w:sz w:val="22"/>
-              </w:rPr>
-              <w:br/>
-              <w:t>Sự cố, sai khác, phát sinh và biện pháp xử lý: Không còn tồn tại ảnh hưởng việc nghiệm thu và đưa hệ thống vào sử dụng. Các yêu cầu hỗ trợ sau bàn giao được quản</w:t>
-            </w:r>
-            <w:r>
-              <w:rPr>
-                <w:sz w:val="22"/>
-              </w:rPr>
-              <w:t xml:space="preserve"> lý theo cam kết bảo hành/hỗ trợ và quy trình vận hành.</w:t>
-            </w:r>
-            <w:r>
-              <w:rPr>
-                <w:sz w:val="22"/>
-              </w:rPr>
-              <w:br/>
-              <w:t>Đề nghị, kiến nghị và ý kiến giải quyết: Các bên thống nhất chấp nhận nghiệm thu, bàn giao sản phẩm để đưa vào sử dụng và thực hiện bảo hành/hỗ trợ theo hợp đồng.</w:t>
-            </w:r>
-          </w:p>
-        </w:tc>
-        <w:tc>
-          <w:tcPr>
-            <w:tcW w:w="6400" w:type="dxa"/>
-            <w:vAlign w:val="center"/>
-          </w:tcPr>
-          <w:p>
-            <w:pPr>
-              <w:spacing w:after="0" w:line="240" w:lineRule="auto"/>
-              <w:rPr>
-                <w:sz w:val="22"/>
-              </w:rPr>
-            </w:pPr>
-            <w:r>
-              <w:rPr>
-                <w:sz w:val="22"/>
-              </w:rPr>
-              <w:lastRenderedPageBreak/>
-              <w:t>[</w:t>
-            </w:r>
-            <w:r>
-              <w:rPr>
-                <w:sz w:val="22"/>
-              </w:rPr>
-              <w:t>Đại diện giám sát/giám sát tác giả g</w:t>
-            </w:r>
-            <w:r>
-              <w:rPr>
-                <w:sz w:val="22"/>
-              </w:rPr>
-              <w:t>hi ý kiến, ký và ghi rõ họ tên theo phạm vi xác nhận.]</w:t>
-            </w:r>
-          </w:p>
-        </w:tc>
-      </w:tr>
-    </w:tbl>
-    <w:p/>
-    <w:p>
-      <w:pPr>
-        <w:pStyle w:val="Heading1"/>
-        <w:spacing w:before="0" w:after="60"/>
-        <w:rPr>
-          <w:color w:val="auto"/>
-          <w:szCs w:val="24"/>
-        </w:rPr>
-      </w:pPr>
-      <w:bookmarkStart w:id="0" w:name="_GoBack"/>
-      <w:r>
-        <w:rPr>
-          <w:rFonts w:ascii="Times New Roman" w:eastAsia="Times New Roman" w:hAnsi="Times New Roman"/>
-          <w:b w:val="0"/>
-          <w:color w:val="auto"/>
-          <w:szCs w:val="24"/>
-        </w:rPr>
-        <w:t>II. Các nội dung khác (nếu có)</w:t>
-      </w:r>
-    </w:p>
-    <w:p>
-      <w:pPr>
-        <w:rPr>
-          <w:sz w:val="24"/>
-          <w:szCs w:val="24"/>
-        </w:rPr>
-      </w:pPr>
-      <w:r>
-        <w:rPr>
-          <w:i/>
-          <w:sz w:val="24"/>
-          <w:szCs w:val="24"/>
-        </w:rPr>
-        <w:t>Hồ sơ kèm theo/đối chiếu: xem đầy đủ tên, mã/số, ngày và phiên bản tại mục Kết quả/sản phẩm đã hoàn thành trong bảng nhật ký.</w:t>
-      </w:r>
-    </w:p>
-    <w:bookmarkEnd w:id="0"/>
-    <w:p>
-      <w:r>
-        <w:t>……………………………………………………………………………….…………………………………………………………………………………………</w:t>
-      </w:r>
-    </w:p>
-    <w:p/>
-    <w:p>
-      <w:r>
-        <w:t>……………………………………………………………………………….…………………………………………………………………………………………</w:t>
-      </w:r>
-    </w:p>
-    <w:p/>
-    <w:p>
-      <w:r>
-        <w:lastRenderedPageBreak/>
-        <w:t>……………………………………………………………………………….…………………………………………………………………………………………</w:t>
-      </w:r>
-    </w:p>
-    <w:p/>
-    <w:p>
-      <w:r>
-        <w:t>……………………………………………………………………………….…………………………………………………………………………………………</w:t>
-      </w:r>
-    </w:p>
-    <w:p/>
-    <w:p/>
+    <w:sectPr>
+      <w:footerReference w:type="default" r:id="rId9"/>
+      <w:pgSz w:w="16838" w:h="11906" w:orient="landscape"/>
+      <w:pgMar w:top="964" w:right="1020" w:bottom="1134" w:left="1020" w:header="567" w:footer="567" w:gutter="0"/>
+      <w:cols w:space="720"/>
+      <w:docGrid w:linePitch="360"/>
+    </w:sectPr>
   </w:body>
 </w:document>
 </file>
@@ -16263,7 +16771,7 @@
 </file>
 
 <file path=customXml/itemProps1.xml><?xml version="1.0" encoding="utf-8"?>
-<ds:datastoreItem xmlns:ds="http://schemas.openxmlformats.org/officeDocument/2006/customXml" ds:itemID="{A1750526-7C4B-4531-A3C2-BFF1E8E51E46}">
+<ds:datastoreItem xmlns:ds="http://schemas.openxmlformats.org/officeDocument/2006/customXml" ds:itemID="{5720A7B7-81EF-4AB9-860B-52D66B59F313}">
   <ds:schemaRefs>
     <ds:schemaRef ds:uri="http://schemas.openxmlformats.org/officeDocument/2006/bibliography"/>
   </ds:schemaRefs>

</xml_diff>